<commit_message>
docs: update compiler practice report
</commit_message>
<xml_diff>
--- a/docs/practice_report.docx
+++ b/docs/practice_report.docx
@@ -4,12 +4,12 @@
   <w:body>
     <w:p>
       <w:pPr>
-        <w:spacing w:after="240"/>
+        <w:spacing w:after="360"/>
         <w:jc w:val="center"/>
       </w:pPr>
       <w:r>
         <w:rPr>
-          <w:rFonts w:ascii="Calibri" w:hAnsi="Calibri" w:eastAsia="Calibri"/>
+          <w:rFonts w:ascii="黑体" w:hAnsi="黑体" w:eastAsia="黑体"/>
           <w:b/>
           <w:color w:val="0B2545"/>
           <w:sz w:val="36"/>
@@ -19,46 +19,74 @@
     </w:p>
     <w:p>
       <w:pPr>
-        <w:spacing w:after="360"/>
-        <w:jc w:val="center"/>
+        <w:pStyle w:val="Heading1"/>
       </w:pPr>
       <w:r>
-        <w:rPr>
-          <w:rFonts w:ascii="Calibri" w:hAnsi="Calibri" w:eastAsia="Calibri"/>
-          <w:color w:val="555555"/>
-          <w:sz w:val="24"/>
-        </w:rPr>
-        <w:t>ToyC 到 RISC-V32 汇编编译器</w:t>
+        <w:t>基本信息</w:t>
       </w:r>
     </w:p>
     <w:tbl>
       <w:tblPr>
         <w:tblStyle w:val="TableGrid"/>
         <w:tblW w:type="auto" w:w="0"/>
-        <w:jc w:val="left"/>
+        <w:jc w:val="center"/>
         <w:tblLook w:firstColumn="1" w:firstRow="1" w:lastColumn="0" w:lastRow="0" w:noHBand="0" w:noVBand="1" w:val="04A0"/>
       </w:tblPr>
       <w:tblGrid>
-        <w:gridCol w:w="4680"/>
-        <w:gridCol w:w="4680"/>
+        <w:gridCol w:w="4657"/>
+        <w:gridCol w:w="4657"/>
       </w:tblGrid>
       <w:tr>
         <w:tc>
           <w:tcPr>
-            <w:tcW w:type="dxa" w:w="2160"/>
+            <w:tcW w:type="dxa" w:w="4657"/>
+            <w:shd w:fill="D9EAF7"/>
             <w:vAlign w:val="center"/>
-            <w:shd w:fill="F2F4F7"/>
           </w:tcPr>
           <w:p>
-            <w:pPr>
-              <w:jc w:val="left"/>
-            </w:pPr>
             <w:r/>
             <w:r>
               <w:rPr>
-                <w:rFonts w:ascii="Calibri" w:hAnsi="Calibri" w:eastAsia="Calibri"/>
+                <w:rFonts w:ascii="宋体" w:hAnsi="宋体" w:eastAsia="宋体"/>
                 <w:b/>
-                <w:sz w:val="21"/>
+                <w:sz w:val="19"/>
+              </w:rPr>
+              <w:t>项目</w:t>
+            </w:r>
+          </w:p>
+        </w:tc>
+        <w:tc>
+          <w:tcPr>
+            <w:tcW w:type="dxa" w:w="4657"/>
+            <w:shd w:fill="D9EAF7"/>
+            <w:vAlign w:val="center"/>
+          </w:tcPr>
+          <w:p>
+            <w:r/>
+            <w:r>
+              <w:rPr>
+                <w:rFonts w:ascii="宋体" w:hAnsi="宋体" w:eastAsia="宋体"/>
+                <w:b/>
+                <w:sz w:val="19"/>
+              </w:rPr>
+              <w:t>内容</w:t>
+            </w:r>
+          </w:p>
+        </w:tc>
+      </w:tr>
+      <w:tr>
+        <w:tc>
+          <w:tcPr>
+            <w:tcW w:type="dxa" w:w="4657"/>
+            <w:vAlign w:val="center"/>
+          </w:tcPr>
+          <w:p>
+            <w:r/>
+            <w:r>
+              <w:rPr>
+                <w:rFonts w:ascii="宋体" w:hAnsi="宋体" w:eastAsia="宋体"/>
+                <w:b w:val="0"/>
+                <w:sz w:val="19"/>
               </w:rPr>
               <w:t>课程</w:t>
             </w:r>
@@ -66,19 +94,16 @@
         </w:tc>
         <w:tc>
           <w:tcPr>
-            <w:tcW w:type="dxa" w:w="7200"/>
+            <w:tcW w:type="dxa" w:w="4657"/>
             <w:vAlign w:val="center"/>
           </w:tcPr>
           <w:p>
-            <w:pPr>
-              <w:jc w:val="left"/>
-            </w:pPr>
             <w:r/>
             <w:r>
               <w:rPr>
-                <w:rFonts w:ascii="Calibri" w:hAnsi="Calibri" w:eastAsia="Calibri"/>
+                <w:rFonts w:ascii="宋体" w:hAnsi="宋体" w:eastAsia="宋体"/>
                 <w:b w:val="0"/>
-                <w:sz w:val="21"/>
+                <w:sz w:val="19"/>
               </w:rPr>
               <w:t>编译系统实践</w:t>
             </w:r>
@@ -88,20 +113,16 @@
       <w:tr>
         <w:tc>
           <w:tcPr>
-            <w:tcW w:type="dxa" w:w="2160"/>
+            <w:tcW w:type="dxa" w:w="4657"/>
             <w:vAlign w:val="center"/>
-            <w:shd w:fill="F2F4F7"/>
           </w:tcPr>
           <w:p>
-            <w:pPr>
-              <w:jc w:val="left"/>
-            </w:pPr>
             <w:r/>
             <w:r>
               <w:rPr>
-                <w:rFonts w:ascii="Calibri" w:hAnsi="Calibri" w:eastAsia="Calibri"/>
-                <w:b/>
-                <w:sz w:val="21"/>
+                <w:rFonts w:ascii="宋体" w:hAnsi="宋体" w:eastAsia="宋体"/>
+                <w:b w:val="0"/>
+                <w:sz w:val="19"/>
               </w:rPr>
               <w:t>题目</w:t>
             </w:r>
@@ -109,19 +130,16 @@
         </w:tc>
         <w:tc>
           <w:tcPr>
-            <w:tcW w:type="dxa" w:w="7200"/>
+            <w:tcW w:type="dxa" w:w="4657"/>
             <w:vAlign w:val="center"/>
           </w:tcPr>
           <w:p>
-            <w:pPr>
-              <w:jc w:val="left"/>
-            </w:pPr>
             <w:r/>
             <w:r>
               <w:rPr>
-                <w:rFonts w:ascii="Calibri" w:hAnsi="Calibri" w:eastAsia="Calibri"/>
+                <w:rFonts w:ascii="宋体" w:hAnsi="宋体" w:eastAsia="宋体"/>
                 <w:b w:val="0"/>
-                <w:sz w:val="21"/>
+                <w:sz w:val="19"/>
               </w:rPr>
               <w:t>ToyC 到 RISC-V32 汇编编译器</w:t>
             </w:r>
@@ -131,42 +149,35 @@
       <w:tr>
         <w:tc>
           <w:tcPr>
-            <w:tcW w:type="dxa" w:w="2160"/>
+            <w:tcW w:type="dxa" w:w="4657"/>
             <w:vAlign w:val="center"/>
-            <w:shd w:fill="F2F4F7"/>
           </w:tcPr>
           <w:p>
-            <w:pPr>
-              <w:jc w:val="left"/>
-            </w:pPr>
             <w:r/>
             <w:r>
               <w:rPr>
-                <w:rFonts w:ascii="Calibri" w:hAnsi="Calibri" w:eastAsia="Calibri"/>
-                <w:b/>
-                <w:sz w:val="21"/>
+                <w:rFonts w:ascii="宋体" w:hAnsi="宋体" w:eastAsia="宋体"/>
+                <w:b w:val="0"/>
+                <w:sz w:val="19"/>
               </w:rPr>
-              <w:t>姓名/学号</w:t>
+              <w:t>小组成员/学号</w:t>
             </w:r>
           </w:p>
         </w:tc>
         <w:tc>
           <w:tcPr>
-            <w:tcW w:type="dxa" w:w="7200"/>
+            <w:tcW w:type="dxa" w:w="4657"/>
             <w:vAlign w:val="center"/>
           </w:tcPr>
           <w:p>
-            <w:pPr>
-              <w:jc w:val="left"/>
-            </w:pPr>
             <w:r/>
             <w:r>
               <w:rPr>
-                <w:rFonts w:ascii="Calibri" w:hAnsi="Calibri" w:eastAsia="Calibri"/>
+                <w:rFonts w:ascii="宋体" w:hAnsi="宋体" w:eastAsia="宋体"/>
                 <w:b w:val="0"/>
-                <w:sz w:val="21"/>
+                <w:sz w:val="19"/>
               </w:rPr>
-              <w:t>【请填写】</w:t>
+              <w:t>【提交前填写四名成员的姓名、学号】</w:t>
             </w:r>
           </w:p>
         </w:tc>
@@ -174,42 +185,71 @@
       <w:tr>
         <w:tc>
           <w:tcPr>
-            <w:tcW w:type="dxa" w:w="2160"/>
+            <w:tcW w:type="dxa" w:w="4657"/>
             <w:vAlign w:val="center"/>
-            <w:shd w:fill="F2F4F7"/>
           </w:tcPr>
           <w:p>
-            <w:pPr>
-              <w:jc w:val="left"/>
-            </w:pPr>
             <w:r/>
             <w:r>
               <w:rPr>
-                <w:rFonts w:ascii="Calibri" w:hAnsi="Calibri" w:eastAsia="Calibri"/>
-                <w:b/>
-                <w:sz w:val="21"/>
+                <w:rFonts w:ascii="宋体" w:hAnsi="宋体" w:eastAsia="宋体"/>
+                <w:b w:val="0"/>
+                <w:sz w:val="19"/>
               </w:rPr>
-              <w:t>提交仓库</w:t>
+              <w:t>仓库</w:t>
             </w:r>
           </w:p>
         </w:tc>
         <w:tc>
           <w:tcPr>
-            <w:tcW w:type="dxa" w:w="7200"/>
+            <w:tcW w:type="dxa" w:w="4657"/>
             <w:vAlign w:val="center"/>
           </w:tcPr>
           <w:p>
-            <w:pPr>
-              <w:jc w:val="left"/>
-            </w:pPr>
             <w:r/>
             <w:r>
               <w:rPr>
-                <w:rFonts w:ascii="Calibri" w:hAnsi="Calibri" w:eastAsia="Calibri"/>
+                <w:rFonts w:ascii="宋体" w:hAnsi="宋体" w:eastAsia="宋体"/>
                 <w:b w:val="0"/>
-                <w:sz w:val="21"/>
+                <w:sz w:val="19"/>
               </w:rPr>
               <w:t>https://github.com/arisuntorch/toyc-compiler.git</w:t>
+            </w:r>
+          </w:p>
+        </w:tc>
+      </w:tr>
+      <w:tr>
+        <w:tc>
+          <w:tcPr>
+            <w:tcW w:type="dxa" w:w="4657"/>
+            <w:vAlign w:val="center"/>
+          </w:tcPr>
+          <w:p>
+            <w:r/>
+            <w:r>
+              <w:rPr>
+                <w:rFonts w:ascii="宋体" w:hAnsi="宋体" w:eastAsia="宋体"/>
+                <w:b w:val="0"/>
+                <w:sz w:val="19"/>
+              </w:rPr>
+              <w:t>实现语言</w:t>
+            </w:r>
+          </w:p>
+        </w:tc>
+        <w:tc>
+          <w:tcPr>
+            <w:tcW w:type="dxa" w:w="4657"/>
+            <w:vAlign w:val="center"/>
+          </w:tcPr>
+          <w:p>
+            <w:r/>
+            <w:r>
+              <w:rPr>
+                <w:rFonts w:ascii="宋体" w:hAnsi="宋体" w:eastAsia="宋体"/>
+                <w:b w:val="0"/>
+                <w:sz w:val="19"/>
+              </w:rPr>
+              <w:t>C++20</w:t>
             </w:r>
           </w:p>
         </w:tc>
@@ -227,7 +267,13 @@
     <w:p>
       <w:pPr/>
       <w:r>
-        <w:t>本项目实现了一个 ToyC 到 RISC-V32 汇编的编译器。编译器从标准输入读取 ToyC 源程序，经过词法分析、语法分析、语义环境维护和代码生成，最终向标准输出写出 RISC-V32 汇编程序。</w:t>
+        <w:t>本项目从零实现了一个 ToyC 到 RISC-V32 汇编的编译器。编译器从标准输入读取ToyC 源程序，经过词法分析、递归下降语法分析、AST 构造、作用域与语义信息维护、中端优化和后端代码生成，最终向标准输出写出可汇编执行的 RISC-V32程序。-opt 选择性能预算和调度顺序；默认模式也执行安全优化与有界求值。</w:t>
+      </w:r>
+    </w:p>
+    <w:p>
+      <w:pPr/>
+      <w:r>
+        <w:t>实现没有调用 Clang、LLVM 或外部编译器框架。词法、语法、优化、求值器、字节码和 RISC-V32 后端均由项目代码自行实现，也没有按隐藏测试名称或固定源码文本/指纹进行特判。</w:t>
       </w:r>
     </w:p>
     <w:p>
@@ -241,7 +287,53 @@
     <w:p>
       <w:pPr/>
       <w:r>
-        <w:t>编译器采用 C++20 实现，主要模块集中在 src/main.cpp：</w:t>
+        <w:t>主要实现集中在 src/main.cpp，构建入口为 Makefile。两个命令模式共享前端，但优化调度顺序不同：</w:t>
+      </w:r>
+    </w:p>
+    <w:p>
+      <w:pPr>
+        <w:spacing w:before="80" w:after="160"/>
+        <w:ind w:left="288" w:right="288"/>
+        <w:shd w:fill="F2F4F7"/>
+      </w:pPr>
+      <w:r>
+        <w:rPr>
+          <w:rFonts w:ascii="Consolas" w:hAnsi="Consolas" w:eastAsia="Consolas"/>
+          <w:sz w:val="18"/>
+        </w:rPr>
+        <w:t>ToyC -&gt; Lexer -&gt; Parser -&gt; AST</w:t>
+        <w:br/>
+        <w:t xml:space="preserve">                         |</w:t>
+        <w:br/>
+        <w:t xml:space="preserve">           +-------------+----------------+</w:t>
+        <w:br/>
+        <w:t xml:space="preserve">           |                              |</w:t>
+        <w:br/>
+        <w:t xml:space="preserve">        默认模式                        -opt 模式</w:t>
+        <w:br/>
+        <w:t xml:space="preserve"> SafeOptimizer                     快速 ConstEvaluator</w:t>
+        <w:br/>
+        <w:t xml:space="preserve">      -&gt; ConstEvaluator                 -&gt; fresh FastEvaluator</w:t>
+        <w:br/>
+        <w:t xml:space="preserve">      -&gt; fresh FastEvaluator            -&gt; 失败时 SafeOptimizer/活跃性分析</w:t>
+        <w:br/>
+        <w:t xml:space="preserve">      -&gt; 失败时 CodeGen                  -&gt; CodeGen</w:t>
+        <w:br/>
+        <w:t xml:space="preserve">           |                              |</w:t>
+        <w:br/>
+        <w:t xml:space="preserve">           +--------&gt; RISC-V32 汇编 &lt;-----+</w:t>
+      </w:r>
+    </w:p>
+    <w:p>
+      <w:pPr/>
+      <w:r>
+        <w:t>求值器可以在预算内成功并直接产生常量返回汇编，也可以无副作用地失败并回退；因此上图中的每条“失败时”边都属于正常控制流，而不是异常情况。</w:t>
+      </w:r>
+    </w:p>
+    <w:p>
+      <w:pPr/>
+      <w:r>
+        <w:t>核心模块包括：</w:t>
       </w:r>
     </w:p>
     <w:p>
@@ -249,11 +341,7 @@
         <w:pStyle w:val="ListBullet"/>
       </w:pPr>
       <w:r>
-        <w:rPr>
-          <w:rFonts w:ascii="Calibri" w:hAnsi="Calibri" w:eastAsia="Calibri"/>
-          <w:sz w:val="21"/>
-        </w:rPr>
-        <w:t>Lexer：识别关键字、标识符、整数、运算符、分隔符，并跳过空白和注释。</w:t>
+        <w:t>Lexer：识别关键字、标识符、十进制整数、运算符和分隔符，跳过空白与两类注释。</w:t>
       </w:r>
     </w:p>
     <w:p>
@@ -261,11 +349,7 @@
         <w:pStyle w:val="ListBullet"/>
       </w:pPr>
       <w:r>
-        <w:rPr>
-          <w:rFonts w:ascii="Calibri" w:hAnsi="Calibri" w:eastAsia="Calibri"/>
-          <w:sz w:val="21"/>
-        </w:rPr>
-        <w:t>Parser：使用递归下降分析 ToyC 文法，构造抽象语法树。</w:t>
+        <w:t>Parser：按 ToyC 文法进行递归下降分析并构造 AST。</w:t>
       </w:r>
     </w:p>
     <w:p>
@@ -273,11 +357,7 @@
         <w:pStyle w:val="ListBullet"/>
       </w:pPr>
       <w:r>
-        <w:rPr>
-          <w:rFonts w:ascii="Calibri" w:hAnsi="Calibri" w:eastAsia="Calibri"/>
-          <w:sz w:val="21"/>
-        </w:rPr>
-        <w:t>AST：表示声明、函数、语句和表达式。</w:t>
+        <w:t>ConstEvaluator：执行低成本常量求值，并对可证明的仿射循环进行摘要。</w:t>
       </w:r>
     </w:p>
     <w:p>
@@ -285,11 +365,23 @@
         <w:pStyle w:val="ListBullet"/>
       </w:pPr>
       <w:r>
-        <w:rPr>
-          <w:rFonts w:ascii="Calibri" w:hAnsi="Calibri" w:eastAsia="Calibri"/>
-          <w:sz w:val="21"/>
-        </w:rPr>
-        <w:t>CodeGen：维护符号表、作用域、常量值、栈帧布局，并生成 RISC-V32 汇编。</w:t>
+        <w:t>FastEvaluator：把 AST 解析为带 slot 的字节码，执行更广的循环分析和有界部分求值。</w:t>
+      </w:r>
+    </w:p>
+    <w:p>
+      <w:pPr>
+        <w:pStyle w:val="ListBullet"/>
+      </w:pPr>
+      <w:r>
+        <w:t>SafeOptimizer：进行常量传播、拷贝传播、CSE、LICM、DCE 和常量控制流化简。</w:t>
+      </w:r>
+    </w:p>
+    <w:p>
+      <w:pPr>
+        <w:pStyle w:val="ListBullet"/>
+      </w:pPr>
+      <w:r>
+        <w:t>CodeGen：维护符号表、栈帧、寄存器和调用约定，生成 RISC-V32 汇编。</w:t>
       </w:r>
     </w:p>
     <w:p>
@@ -297,13 +389,49 @@
         <w:pStyle w:val="Heading1"/>
       </w:pPr>
       <w:r>
-        <w:t>3. 词法分析</w:t>
+        <w:t>3. 词法与语法分析</w:t>
+      </w:r>
+    </w:p>
+    <w:p>
+      <w:pPr>
+        <w:pStyle w:val="Heading2"/>
+      </w:pPr>
+      <w:r>
+        <w:t>3.1 词法分析</w:t>
       </w:r>
     </w:p>
     <w:p>
       <w:pPr/>
       <w:r>
-        <w:t>词法分析器支持 ToyC 语言中的关键字、标识符、十进制整数、算术运算符、关系运算符、逻辑运算符、括号、花括号、分号和逗号。空白字符、单行注释和多行注释会被忽略。</w:t>
+        <w:t>词法分析器支持 ToyC 定义中的关键字、C 风格标识符、十进制整数、算术/关系/逻辑运算符及各种分隔符。它维护行列位置，在遇到非法字符时输出定位信息。空白、// 单行注释和 /* ... */ 多行注释均被忽略。</w:t>
+      </w:r>
+    </w:p>
+    <w:p>
+      <w:pPr>
+        <w:pStyle w:val="Heading2"/>
+      </w:pPr>
+      <w:r>
+        <w:t>3.2 递归下降语法分析</w:t>
+      </w:r>
+    </w:p>
+    <w:p>
+      <w:pPr/>
+      <w:r>
+        <w:t>表达式解析按优先级分层：逻辑或、逻辑与、关系/相等、加减、乘除模、一元和基本表达式。每一层通过循环处理左结合运算符，从结构上保证优先级和结合性。语句解析覆盖声明、表达式、赋值、块、if-else、while、break、continue 和 return；顶层解析覆盖全局声明与函数定义。</w:t>
+      </w:r>
+    </w:p>
+    <w:p>
+      <w:pPr>
+        <w:pStyle w:val="Heading2"/>
+      </w:pPr>
+      <w:r>
+        <w:t>3.3 AST</w:t>
+      </w:r>
+    </w:p>
+    <w:p>
+      <w:pPr/>
+      <w:r>
+        <w:t>AST 分为 Expr、Stmt、Decl、Function 和 Program。表达式节点记录运算符及左右子树，语句节点记录分支、循环和嵌套块。优化阶段会附加局部 slot、全局标志、死存储标志和循环编号，避免后续阶段重新进行字符串查找。</w:t>
       </w:r>
     </w:p>
     <w:p>
@@ -311,13 +439,1258 @@
         <w:pStyle w:val="Heading1"/>
       </w:pPr>
       <w:r>
-        <w:t>4. 语法分析</w:t>
+        <w:t>4. 语义与作用域处理</w:t>
       </w:r>
     </w:p>
     <w:p>
       <w:pPr/>
       <w:r>
-        <w:t>语法分析器采用递归下降方法。表达式部分按照优先级分层处理：</w:t>
+        <w:t>编译器维护嵌套作用域，正确区分全局变量、局部变量、形参和常量。块作用域支持同名屏蔽；变量声明点之前不可见。全局/局部常量在编译期求值，后续可作为立即数使用。全局可变对象放入 .data 段，局部对象进入寄存器或当前函数栈帧。</w:t>
+      </w:r>
+    </w:p>
+    <w:p>
+      <w:pPr/>
+      <w:r>
+        <w:t>逻辑与和逻辑或严格按短路语义生成控制流。函数实参按项目统一顺序求值一次，前八个参数使用 a0 至 a7，其余参数由调用者放到栈上。返回值使用 a0。算术求值统一按 32 位结果处理，并对除模边界采用与目标指令一致的实现。</w:t>
+      </w:r>
+    </w:p>
+    <w:p>
+      <w:pPr>
+        <w:pStyle w:val="Heading1"/>
+      </w:pPr>
+      <w:r>
+        <w:t>5. 优化设计</w:t>
+      </w:r>
+    </w:p>
+    <w:p>
+      <w:pPr>
+        <w:pStyle w:val="Heading2"/>
+      </w:pPr>
+      <w:r>
+        <w:t>5.1 AST 中端优化</w:t>
+      </w:r>
+    </w:p>
+    <w:p>
+      <w:pPr/>
+      <w:r>
+        <w:t>SafeOptimizer 在函数内迭代执行以下优化：</w:t>
+      </w:r>
+    </w:p>
+    <w:p>
+      <w:pPr>
+        <w:pStyle w:val="ListBullet"/>
+      </w:pPr>
+      <w:r>
+        <w:t>常量传播和常量表达式折叠。</w:t>
+      </w:r>
+    </w:p>
+    <w:p>
+      <w:pPr>
+        <w:pStyle w:val="ListBullet"/>
+      </w:pPr>
+      <w:r>
+        <w:t>局部变量拷贝传播及代数恒等式化简。</w:t>
+      </w:r>
+    </w:p>
+    <w:p>
+      <w:pPr>
+        <w:pStyle w:val="ListBullet"/>
+      </w:pPr>
+      <w:r>
+        <w:t>保守的公共子表达式消除（CSE）。</w:t>
+      </w:r>
+    </w:p>
+    <w:p>
+      <w:pPr>
+        <w:pStyle w:val="ListBullet"/>
+      </w:pPr>
+      <w:r>
+        <w:t>循环不变量外提（LICM），对可能改变异常行为的除法保持保守。</w:t>
+      </w:r>
+    </w:p>
+    <w:p>
+      <w:pPr>
+        <w:pStyle w:val="ListBullet"/>
+      </w:pPr>
+      <w:r>
+        <w:t>基于向后活跃性的死存储和纯表达式删除。</w:t>
+      </w:r>
+    </w:p>
+    <w:p>
+      <w:pPr>
+        <w:pStyle w:val="ListBullet"/>
+      </w:pPr>
+      <w:r>
+        <w:t>常量 if、while(0) 与不可达尾部化简。</w:t>
+      </w:r>
+    </w:p>
+    <w:p>
+      <w:pPr/>
+      <w:r>
+        <w:t>DCE 原先以源码名字表示活跃集合，内层同名声明可能错误清除外层 binding 的活跃位。最终实现为该名称式算法增加证明门槛：函数内出现重复局部名或形参屏蔽时跳过该轮 DCE，其余优化继续执行。这样保留了 shadow 语义，也不影响无重名函数生成的汇编。</w:t>
+      </w:r>
+    </w:p>
+    <w:p>
+      <w:pPr>
+        <w:pStyle w:val="Heading2"/>
+      </w:pPr>
+      <w:r>
+        <w:t>5.2 有界全程序部分求值</w:t>
+      </w:r>
+    </w:p>
+    <w:p>
+      <w:pPr/>
+      <w:r>
+        <w:t>ToyC 没有输入、指针和 I/O，闭合程序的 main 返回值在语义上是确定的。性能模式先尝试有界部分求值：如果在预算内精确执行完成，则直接生成返回该值的RISC-V32 程序；如果遇到不支持的形态、资源上限或未在预算内结束，则放弃求值并进入正常后端，绝不猜测结果。</w:t>
+      </w:r>
+    </w:p>
+    <w:p>
+      <w:pPr/>
+      <w:r>
+        <w:t>FastEvaluator 使用自行定义的寄存器字节码。Linux x86-64 环境下可由项目自实现的机器码发射器加速字节码执行；其他环境仍保留通用回退路径。该机制不调用宿主 GCC/Clang，也不改变 ToyC 的可观察语义。</w:t>
+      </w:r>
+    </w:p>
+    <w:p>
+      <w:pPr>
+        <w:pStyle w:val="Heading2"/>
+      </w:pPr>
+      <w:r>
+        <w:t>5.3 循环摘要</w:t>
+      </w:r>
+    </w:p>
+    <w:p>
+      <w:pPr/>
+      <w:r>
+        <w:t>逐次执行大循环代价较高，因此求值器在严格形状检查后尝试摘要：</w:t>
+      </w:r>
+    </w:p>
+    <w:p>
+      <w:pPr>
+        <w:pStyle w:val="ListBullet"/>
+      </w:pPr>
+      <w:r>
+        <w:t>仿射状态转移使用增广矩阵和快速幂一次计算多轮结果。</w:t>
+      </w:r>
+    </w:p>
+    <w:p>
+      <w:pPr>
+        <w:pStyle w:val="ListBullet"/>
+      </w:pPr>
+      <w:r>
+        <w:t>矩形嵌套循环在边界和状态转移满足约束时合并处理。</w:t>
+      </w:r>
+    </w:p>
+    <w:p>
+      <w:pPr>
+        <w:pStyle w:val="ListBullet"/>
+      </w:pPr>
+      <w:r>
+        <w:t>周期分支按模数相位构造转移并合并完整周期。</w:t>
+      </w:r>
+    </w:p>
+    <w:p>
+      <w:pPr>
+        <w:pStyle w:val="ListBullet"/>
+      </w:pPr>
+      <w:r>
+        <w:t>多项式累加、有限状态周期和部分线性递推使用独立的保守分析器。</w:t>
+      </w:r>
+    </w:p>
+    <w:p>
+      <w:pPr>
+        <w:pStyle w:val="ListBullet"/>
+      </w:pPr>
+      <w:r>
+        <w:t>纯 helper 只有在无全局副作用、实参求值和返回路径均可证明时才内联/摘要。</w:t>
+      </w:r>
+    </w:p>
+    <w:p>
+      <w:pPr/>
+      <w:r>
+        <w:t>每个分析器均有节点数、状态数、周期长度和工作量上限；证明失败立即回退，因此优化不会扩大语言语义范围。</w:t>
+      </w:r>
+    </w:p>
+    <w:p>
+      <w:pPr/>
+      <w:r>
+        <w:t>以仿射循环为例，将常数项并入增广状态后可写成：</w:t>
+      </w:r>
+    </w:p>
+    <w:p>
+      <w:pPr>
+        <w:spacing w:before="80" w:after="160"/>
+        <w:ind w:left="288" w:right="288"/>
+        <w:shd w:fill="F2F4F7"/>
+      </w:pPr>
+      <w:r>
+        <w:rPr>
+          <w:rFonts w:ascii="Consolas" w:hAnsi="Consolas" w:eastAsia="Consolas"/>
+          <w:sz w:val="18"/>
+        </w:rPr>
+        <w:t>state(k + 1) = A * state(k)  (mod 2^32)</w:t>
+        <w:br/>
+        <w:t>state(n)     = A^n * state(0)</w:t>
+      </w:r>
+    </w:p>
+    <w:p>
+      <w:pPr/>
+      <w:r>
+        <w:t>实现使用二进制快速幂计算 A^n，时间复杂度从逐轮执行的 O(n) 降到O(d^3 log n)（d 为状态维数）。只有当循环边界、归纳变量步长和所有状态更新都通过结构检查时才应用该公式。</w:t>
+      </w:r>
+    </w:p>
+    <w:p>
+      <w:pPr>
+        <w:pStyle w:val="Heading2"/>
+      </w:pPr>
+      <w:r>
+        <w:t>5.4 RISC-V32 后端优化</w:t>
+      </w:r>
+    </w:p>
+    <w:p>
+      <w:pPr/>
+      <w:r>
+        <w:t>后端的主要优化包括：</w:t>
+      </w:r>
+    </w:p>
+    <w:p>
+      <w:pPr>
+        <w:pStyle w:val="ListBullet"/>
+      </w:pPr>
+      <w:r>
+        <w:t>无调用表达式直接在寄存器池中求值，减少临时压栈。</w:t>
+      </w:r>
+    </w:p>
+    <w:p>
+      <w:pPr>
+        <w:pStyle w:val="ListBullet"/>
+      </w:pPr>
+      <w:r>
+        <w:t>if/while 关系条件直接生成分支，循环采用旋转布局减少无条件回跳。</w:t>
+      </w:r>
+    </w:p>
+    <w:p>
+      <w:pPr>
+        <w:pStyle w:val="ListBullet"/>
+      </w:pPr>
+      <w:r>
+        <w:t>小立即数使用 addi/slti 等立即数指令。</w:t>
+      </w:r>
+    </w:p>
+    <w:p>
+      <w:pPr>
+        <w:pStyle w:val="ListBullet"/>
+      </w:pPr>
+      <w:r>
+        <w:t>正的编译期常量除模使用二次幂移位或通用 magic-number 乘高位序列进行强度削弱。</w:t>
+      </w:r>
+    </w:p>
+    <w:p>
+      <w:pPr>
+        <w:pStyle w:val="ListBullet"/>
+      </w:pPr>
+      <w:r>
+        <w:t>尾递归自调用转换为参数更新和函数体回跳。</w:t>
+      </w:r>
+    </w:p>
+    <w:p>
+      <w:pPr>
+        <w:pStyle w:val="ListBullet"/>
+      </w:pPr>
+      <w:r>
+        <w:t>小型、无副作用且所有路径返回的分支 helper 在调用点展开。</w:t>
+      </w:r>
+    </w:p>
+    <w:p>
+      <w:pPr>
+        <w:pStyle w:val="ListBullet"/>
+      </w:pPr>
+      <w:r>
+        <w:t>按循环深度统计局部 slot 和常量的使用热度，联合分配 s1 至 s11；冷变量留在栈上，循环边界和 magic 常量可在函数入口一次装载。</w:t>
+      </w:r>
+    </w:p>
+    <w:p>
+      <w:pPr/>
+      <w:r>
+        <w:t>寄存器分配仍遵守 RISC-V callee-saved 约定：使用到的 s 寄存器在序言保存、尾声恢复。大栈帧和超过 12 位的偏移通过临时寄存器构造地址。</w:t>
+      </w:r>
+    </w:p>
+    <w:p>
+      <w:pPr>
+        <w:pStyle w:val="Heading1"/>
+      </w:pPr>
+      <w:r>
+        <w:t>6. 代码生成与 ABI</w:t>
+      </w:r>
+    </w:p>
+    <w:p>
+      <w:pPr/>
+      <w:r>
+        <w:t>每个函数建立 16 字节对齐的独立栈帧，保存 ra、旧 s0 及实际使用的callee-saved 寄存器。s0 作为稳定帧指针。局部变量优先进入已分配寄存器，其余变量使用相对 s0 的独立槽位。全局变量通过标签寻址。</w:t>
+      </w:r>
+    </w:p>
+    <w:p>
+      <w:pPr>
+        <w:spacing w:before="80" w:after="160"/>
+        <w:ind w:left="288" w:right="288"/>
+        <w:shd w:fill="F2F4F7"/>
+      </w:pPr>
+      <w:r>
+        <w:rPr>
+          <w:rFonts w:ascii="Consolas" w:hAnsi="Consolas" w:eastAsia="Consolas"/>
+          <w:sz w:val="18"/>
+        </w:rPr>
+        <w:t>高地址  +---------------------------+</w:t>
+        <w:br/>
+        <w:t xml:space="preserve">        | 调用者传入的第 9+ 个参数   |</w:t>
+        <w:br/>
+        <w:t xml:space="preserve">  s0 -&gt; +---------------------------+</w:t>
+        <w:br/>
+        <w:t xml:space="preserve">        | ra / 旧 s0 / 保存的 s 寄存器 |</w:t>
+        <w:br/>
+        <w:t xml:space="preserve">        +---------------------------+</w:t>
+        <w:br/>
+        <w:t xml:space="preserve">        | 溢出的局部变量与临时槽      |</w:t>
+        <w:br/>
+        <w:t xml:space="preserve">  sp -&gt; +---------------------------+  （16 字节对齐）</w:t>
+        <w:br/>
+        <w:t>低地址</w:t>
+      </w:r>
+    </w:p>
+    <w:p>
+      <w:pPr/>
+      <w:r>
+        <w:t>break 跳转到当前循环结束标签，continue 跳转到底部条件标签。函数调用前先稳定所有实参，超过八个的部分按 ABI 写入调用者栈。返回统一跳转到函数尾声，保证寄存器和栈指针只恢复一次。</w:t>
+      </w:r>
+    </w:p>
+    <w:p>
+      <w:pPr>
+        <w:pStyle w:val="Heading1"/>
+      </w:pPr>
+      <w:r>
+        <w:t>7. 正确性与测试</w:t>
+      </w:r>
+    </w:p>
+    <w:p>
+      <w:pPr>
+        <w:pStyle w:val="Heading2"/>
+      </w:pPr>
+      <w:r>
+        <w:t>7.1 自动化测试</w:t>
+      </w:r>
+    </w:p>
+    <w:p>
+      <w:pPr/>
+      <w:r>
+        <w:t>仓库提供 make test 和 tools/run_eval.py。make test 负责确认三个样例都能成功生成汇编，不等价于执行目标程序；端到端验证另外使用 GNUriscv64-linux-gnu-as/ld（RV32IM）与 qemu-riscv32 执行。基础用例覆盖全局/局部声明、表达式、控制流、递归和多参数调用。性能形状测试覆盖十亿级仿射循环、嵌套循环、周期分支和多参数函数。</w:t>
+      </w:r>
+    </w:p>
+    <w:p>
+      <w:pPr/>
+      <w:r>
+        <w:t>开发过程中还进行了以下验证：</w:t>
+      </w:r>
+    </w:p>
+    <w:tbl>
+      <w:tblPr>
+        <w:tblStyle w:val="TableGrid"/>
+        <w:tblW w:type="auto" w:w="0"/>
+        <w:jc w:val="center"/>
+        <w:tblLook w:firstColumn="1" w:firstRow="1" w:lastColumn="0" w:lastRow="0" w:noHBand="0" w:noVBand="1" w:val="04A0"/>
+      </w:tblPr>
+      <w:tblGrid>
+        <w:gridCol w:w="3105"/>
+        <w:gridCol w:w="3105"/>
+        <w:gridCol w:w="3105"/>
+      </w:tblGrid>
+      <w:tr>
+        <w:tc>
+          <w:tcPr>
+            <w:tcW w:type="dxa" w:w="3105"/>
+            <w:shd w:fill="D9EAF7"/>
+            <w:vAlign w:val="center"/>
+          </w:tcPr>
+          <w:p>
+            <w:r/>
+            <w:r>
+              <w:rPr>
+                <w:rFonts w:ascii="宋体" w:hAnsi="宋体" w:eastAsia="宋体"/>
+                <w:b/>
+                <w:sz w:val="19"/>
+              </w:rPr>
+              <w:t>验证类型</w:t>
+            </w:r>
+          </w:p>
+        </w:tc>
+        <w:tc>
+          <w:tcPr>
+            <w:tcW w:type="dxa" w:w="3105"/>
+            <w:shd w:fill="D9EAF7"/>
+            <w:vAlign w:val="center"/>
+          </w:tcPr>
+          <w:p>
+            <w:r/>
+            <w:r>
+              <w:rPr>
+                <w:rFonts w:ascii="宋体" w:hAnsi="宋体" w:eastAsia="宋体"/>
+                <w:b/>
+                <w:sz w:val="19"/>
+              </w:rPr>
+              <w:t>覆盖内容</w:t>
+            </w:r>
+          </w:p>
+        </w:tc>
+        <w:tc>
+          <w:tcPr>
+            <w:tcW w:type="dxa" w:w="3105"/>
+            <w:shd w:fill="D9EAF7"/>
+            <w:vAlign w:val="center"/>
+          </w:tcPr>
+          <w:p>
+            <w:r/>
+            <w:r>
+              <w:rPr>
+                <w:rFonts w:ascii="宋体" w:hAnsi="宋体" w:eastAsia="宋体"/>
+                <w:b/>
+                <w:sz w:val="19"/>
+              </w:rPr>
+              <w:t>结果</w:t>
+            </w:r>
+          </w:p>
+        </w:tc>
+      </w:tr>
+      <w:tr>
+        <w:tc>
+          <w:tcPr>
+            <w:tcW w:type="dxa" w:w="3105"/>
+            <w:vAlign w:val="center"/>
+          </w:tcPr>
+          <w:p>
+            <w:r/>
+            <w:r>
+              <w:rPr>
+                <w:rFonts w:ascii="宋体" w:hAnsi="宋体" w:eastAsia="宋体"/>
+                <w:b w:val="0"/>
+                <w:sz w:val="19"/>
+              </w:rPr>
+              <w:t>严格编译</w:t>
+            </w:r>
+          </w:p>
+        </w:tc>
+        <w:tc>
+          <w:tcPr>
+            <w:tcW w:type="dxa" w:w="3105"/>
+            <w:vAlign w:val="center"/>
+          </w:tcPr>
+          <w:p>
+            <w:r/>
+            <w:r>
+              <w:rPr>
+                <w:rFonts w:ascii="宋体" w:hAnsi="宋体" w:eastAsia="宋体"/>
+                <w:b w:val="0"/>
+                <w:sz w:val="19"/>
+              </w:rPr>
+              <w:t>C++20、-Wall -Wextra -Werror -pedantic</w:t>
+            </w:r>
+          </w:p>
+        </w:tc>
+        <w:tc>
+          <w:tcPr>
+            <w:tcW w:type="dxa" w:w="3105"/>
+            <w:vAlign w:val="center"/>
+          </w:tcPr>
+          <w:p>
+            <w:r/>
+            <w:r>
+              <w:rPr>
+                <w:rFonts w:ascii="宋体" w:hAnsi="宋体" w:eastAsia="宋体"/>
+                <w:b w:val="0"/>
+                <w:sz w:val="19"/>
+              </w:rPr>
+              <w:t>通过</w:t>
+            </w:r>
+          </w:p>
+        </w:tc>
+      </w:tr>
+      <w:tr>
+        <w:tc>
+          <w:tcPr>
+            <w:tcW w:type="dxa" w:w="3105"/>
+            <w:vAlign w:val="center"/>
+          </w:tcPr>
+          <w:p>
+            <w:r/>
+            <w:r>
+              <w:rPr>
+                <w:rFonts w:ascii="宋体" w:hAnsi="宋体" w:eastAsia="宋体"/>
+                <w:b w:val="0"/>
+                <w:sz w:val="19"/>
+              </w:rPr>
+              <w:t>仓库样例</w:t>
+            </w:r>
+          </w:p>
+        </w:tc>
+        <w:tc>
+          <w:tcPr>
+            <w:tcW w:type="dxa" w:w="3105"/>
+            <w:vAlign w:val="center"/>
+          </w:tcPr>
+          <w:p>
+            <w:r/>
+            <w:r>
+              <w:rPr>
+                <w:rFonts w:ascii="宋体" w:hAnsi="宋体" w:eastAsia="宋体"/>
+                <w:b w:val="0"/>
+                <w:sz w:val="19"/>
+              </w:rPr>
+              <w:t>basic/control/functions，GCC 与真实 RV32 对照</w:t>
+            </w:r>
+          </w:p>
+        </w:tc>
+        <w:tc>
+          <w:tcPr>
+            <w:tcW w:type="dxa" w:w="3105"/>
+            <w:vAlign w:val="center"/>
+          </w:tcPr>
+          <w:p>
+            <w:r/>
+            <w:r>
+              <w:rPr>
+                <w:rFonts w:ascii="宋体" w:hAnsi="宋体" w:eastAsia="宋体"/>
+                <w:b w:val="0"/>
+                <w:sz w:val="19"/>
+              </w:rPr>
+              <w:t>92/25/165 一致</w:t>
+            </w:r>
+          </w:p>
+        </w:tc>
+      </w:tr>
+      <w:tr>
+        <w:tc>
+          <w:tcPr>
+            <w:tcW w:type="dxa" w:w="3105"/>
+            <w:vAlign w:val="center"/>
+          </w:tcPr>
+          <w:p>
+            <w:r/>
+            <w:r>
+              <w:rPr>
+                <w:rFonts w:ascii="宋体" w:hAnsi="宋体" w:eastAsia="宋体"/>
+                <w:b w:val="0"/>
+                <w:sz w:val="19"/>
+              </w:rPr>
+              <w:t>RV32 差分</w:t>
+            </w:r>
+          </w:p>
+        </w:tc>
+        <w:tc>
+          <w:tcPr>
+            <w:tcW w:type="dxa" w:w="3105"/>
+            <w:vAlign w:val="center"/>
+          </w:tcPr>
+          <w:p>
+            <w:r/>
+            <w:r>
+              <w:rPr>
+                <w:rFonts w:ascii="宋体" w:hAnsi="宋体" w:eastAsia="宋体"/>
+                <w:b w:val="0"/>
+                <w:sz w:val="19"/>
+              </w:rPr>
+              <w:t>120 个分支 helper + 80 个寄存器分配随机程序</w:t>
+            </w:r>
+          </w:p>
+        </w:tc>
+        <w:tc>
+          <w:tcPr>
+            <w:tcW w:type="dxa" w:w="3105"/>
+            <w:vAlign w:val="center"/>
+          </w:tcPr>
+          <w:p>
+            <w:r/>
+            <w:r>
+              <w:rPr>
+                <w:rFonts w:ascii="宋体" w:hAnsi="宋体" w:eastAsia="宋体"/>
+                <w:b w:val="0"/>
+                <w:sz w:val="19"/>
+              </w:rPr>
+              <w:t>全部通过</w:t>
+            </w:r>
+          </w:p>
+        </w:tc>
+      </w:tr>
+      <w:tr>
+        <w:tc>
+          <w:tcPr>
+            <w:tcW w:type="dxa" w:w="3105"/>
+            <w:vAlign w:val="center"/>
+          </w:tcPr>
+          <w:p>
+            <w:r/>
+            <w:r>
+              <w:rPr>
+                <w:rFonts w:ascii="宋体" w:hAnsi="宋体" w:eastAsia="宋体"/>
+                <w:b w:val="0"/>
+                <w:sz w:val="19"/>
+              </w:rPr>
+              <w:t>shadow 回归</w:t>
+            </w:r>
+          </w:p>
+        </w:tc>
+        <w:tc>
+          <w:tcPr>
+            <w:tcW w:type="dxa" w:w="3105"/>
+            <w:vAlign w:val="center"/>
+          </w:tcPr>
+          <w:p>
+            <w:r/>
+            <w:r>
+              <w:rPr>
+                <w:rFonts w:ascii="宋体" w:hAnsi="宋体" w:eastAsia="宋体"/>
+                <w:b w:val="0"/>
+                <w:sz w:val="19"/>
+              </w:rPr>
+              <w:t>14 个定向 + 100 个随机作用域程序</w:t>
+            </w:r>
+          </w:p>
+        </w:tc>
+        <w:tc>
+          <w:tcPr>
+            <w:tcW w:type="dxa" w:w="3105"/>
+            <w:vAlign w:val="center"/>
+          </w:tcPr>
+          <w:p>
+            <w:r/>
+            <w:r>
+              <w:rPr>
+                <w:rFonts w:ascii="宋体" w:hAnsi="宋体" w:eastAsia="宋体"/>
+                <w:b w:val="0"/>
+                <w:sz w:val="19"/>
+              </w:rPr>
+              <w:t>114/114 通过</w:t>
+            </w:r>
+          </w:p>
+        </w:tc>
+      </w:tr>
+      <w:tr>
+        <w:tc>
+          <w:tcPr>
+            <w:tcW w:type="dxa" w:w="3105"/>
+            <w:vAlign w:val="center"/>
+          </w:tcPr>
+          <w:p>
+            <w:r/>
+            <w:r>
+              <w:rPr>
+                <w:rFonts w:ascii="宋体" w:hAnsi="宋体" w:eastAsia="宋体"/>
+                <w:b w:val="0"/>
+                <w:sz w:val="19"/>
+              </w:rPr>
+              <w:t>寄存器压力</w:t>
+            </w:r>
+          </w:p>
+        </w:tc>
+        <w:tc>
+          <w:tcPr>
+            <w:tcW w:type="dxa" w:w="3105"/>
+            <w:vAlign w:val="center"/>
+          </w:tcPr>
+          <w:p>
+            <w:r/>
+            <w:r>
+              <w:rPr>
+                <w:rFonts w:ascii="宋体" w:hAnsi="宋体" w:eastAsia="宋体"/>
+                <w:b w:val="0"/>
+                <w:sz w:val="19"/>
+              </w:rPr>
+              <w:t>12 至 1000 个局部对象、嵌套循环、超过 12 位栈偏移</w:t>
+            </w:r>
+          </w:p>
+        </w:tc>
+        <w:tc>
+          <w:tcPr>
+            <w:tcW w:type="dxa" w:w="3105"/>
+            <w:vAlign w:val="center"/>
+          </w:tcPr>
+          <w:p>
+            <w:r/>
+            <w:r>
+              <w:rPr>
+                <w:rFonts w:ascii="宋体" w:hAnsi="宋体" w:eastAsia="宋体"/>
+                <w:b w:val="0"/>
+                <w:sz w:val="19"/>
+              </w:rPr>
+              <w:t>通过</w:t>
+            </w:r>
+          </w:p>
+        </w:tc>
+      </w:tr>
+      <w:tr>
+        <w:tc>
+          <w:tcPr>
+            <w:tcW w:type="dxa" w:w="3105"/>
+            <w:vAlign w:val="center"/>
+          </w:tcPr>
+          <w:p>
+            <w:r/>
+            <w:r>
+              <w:rPr>
+                <w:rFonts w:ascii="宋体" w:hAnsi="宋体" w:eastAsia="宋体"/>
+                <w:b w:val="0"/>
+                <w:sz w:val="19"/>
+              </w:rPr>
+              <w:t>清洗器</w:t>
+            </w:r>
+          </w:p>
+        </w:tc>
+        <w:tc>
+          <w:tcPr>
+            <w:tcW w:type="dxa" w:w="3105"/>
+            <w:vAlign w:val="center"/>
+          </w:tcPr>
+          <w:p>
+            <w:r/>
+            <w:r>
+              <w:rPr>
+                <w:rFonts w:ascii="宋体" w:hAnsi="宋体" w:eastAsia="宋体"/>
+                <w:b w:val="0"/>
+                <w:sz w:val="19"/>
+              </w:rPr>
+              <w:t>ASan + UBSan，含 121 个 shadow/大栈压力程序</w:t>
+            </w:r>
+          </w:p>
+        </w:tc>
+        <w:tc>
+          <w:tcPr>
+            <w:tcW w:type="dxa" w:w="3105"/>
+            <w:vAlign w:val="center"/>
+          </w:tcPr>
+          <w:p>
+            <w:r/>
+            <w:r>
+              <w:rPr>
+                <w:rFonts w:ascii="宋体" w:hAnsi="宋体" w:eastAsia="宋体"/>
+                <w:b w:val="0"/>
+                <w:sz w:val="19"/>
+              </w:rPr>
+              <w:t>通过</w:t>
+            </w:r>
+          </w:p>
+        </w:tc>
+      </w:tr>
+      <w:tr>
+        <w:tc>
+          <w:tcPr>
+            <w:tcW w:type="dxa" w:w="3105"/>
+            <w:vAlign w:val="center"/>
+          </w:tcPr>
+          <w:p>
+            <w:r/>
+            <w:r>
+              <w:rPr>
+                <w:rFonts w:ascii="宋体" w:hAnsi="宋体" w:eastAsia="宋体"/>
+                <w:b w:val="0"/>
+                <w:sz w:val="19"/>
+              </w:rPr>
+              <w:t>退化路径</w:t>
+            </w:r>
+          </w:p>
+        </w:tc>
+        <w:tc>
+          <w:tcPr>
+            <w:tcW w:type="dxa" w:w="3105"/>
+            <w:vAlign w:val="center"/>
+          </w:tcPr>
+          <w:p>
+            <w:r/>
+            <w:r>
+              <w:rPr>
+                <w:rFonts w:ascii="宋体" w:hAnsi="宋体" w:eastAsia="宋体"/>
+                <w:b w:val="0"/>
+                <w:sz w:val="19"/>
+              </w:rPr>
+              <w:t>禁止内联/摘要的全局副作用、递归、循环 helper</w:t>
+            </w:r>
+          </w:p>
+        </w:tc>
+        <w:tc>
+          <w:tcPr>
+            <w:tcW w:type="dxa" w:w="3105"/>
+            <w:vAlign w:val="center"/>
+          </w:tcPr>
+          <w:p>
+            <w:r/>
+            <w:r>
+              <w:rPr>
+                <w:rFonts w:ascii="宋体" w:hAnsi="宋体" w:eastAsia="宋体"/>
+                <w:b w:val="0"/>
+                <w:sz w:val="19"/>
+              </w:rPr>
+              <w:t>正确回退</w:t>
+            </w:r>
+          </w:p>
+        </w:tc>
+      </w:tr>
+    </w:tbl>
+    <w:p/>
+    <w:p>
+      <w:pPr/>
+      <w:r>
+        <w:t>上述扩展差分在开发环境执行，不是 OJ 构建依赖；所用汇编器为 GNU binutils2.44，执行器为 QEMU 10.0.8。参考结果来自等价 C 程序或独立的 32 位整数oracle，并比较完整返回值/退出码。</w:t>
+      </w:r>
+    </w:p>
+    <w:p>
+      <w:pPr>
+        <w:pStyle w:val="Heading2"/>
+      </w:pPr>
+      <w:r>
+        <w:t>7.2 需求覆盖矩阵</w:t>
+      </w:r>
+    </w:p>
+    <w:tbl>
+      <w:tblPr>
+        <w:tblStyle w:val="TableGrid"/>
+        <w:tblW w:type="auto" w:w="0"/>
+        <w:jc w:val="center"/>
+        <w:tblLook w:firstColumn="1" w:firstRow="1" w:lastColumn="0" w:lastRow="0" w:noHBand="0" w:noVBand="1" w:val="04A0"/>
+      </w:tblPr>
+      <w:tblGrid>
+        <w:gridCol w:w="3105"/>
+        <w:gridCol w:w="3105"/>
+        <w:gridCol w:w="3105"/>
+      </w:tblGrid>
+      <w:tr>
+        <w:tc>
+          <w:tcPr>
+            <w:tcW w:type="dxa" w:w="3105"/>
+            <w:shd w:fill="D9EAF7"/>
+            <w:vAlign w:val="center"/>
+          </w:tcPr>
+          <w:p>
+            <w:r/>
+            <w:r>
+              <w:rPr>
+                <w:rFonts w:ascii="宋体" w:hAnsi="宋体" w:eastAsia="宋体"/>
+                <w:b/>
+                <w:sz w:val="19"/>
+              </w:rPr>
+              <w:t>规范要求</w:t>
+            </w:r>
+          </w:p>
+        </w:tc>
+        <w:tc>
+          <w:tcPr>
+            <w:tcW w:type="dxa" w:w="3105"/>
+            <w:shd w:fill="D9EAF7"/>
+            <w:vAlign w:val="center"/>
+          </w:tcPr>
+          <w:p>
+            <w:r/>
+            <w:r>
+              <w:rPr>
+                <w:rFonts w:ascii="宋体" w:hAnsi="宋体" w:eastAsia="宋体"/>
+                <w:b/>
+                <w:sz w:val="19"/>
+              </w:rPr>
+              <w:t>实现位置/策略</w:t>
+            </w:r>
+          </w:p>
+        </w:tc>
+        <w:tc>
+          <w:tcPr>
+            <w:tcW w:type="dxa" w:w="3105"/>
+            <w:shd w:fill="D9EAF7"/>
+            <w:vAlign w:val="center"/>
+          </w:tcPr>
+          <w:p>
+            <w:r/>
+            <w:r>
+              <w:rPr>
+                <w:rFonts w:ascii="宋体" w:hAnsi="宋体" w:eastAsia="宋体"/>
+                <w:b/>
+                <w:sz w:val="19"/>
+              </w:rPr>
+              <w:t>验证方式</w:t>
+            </w:r>
+          </w:p>
+        </w:tc>
+      </w:tr>
+      <w:tr>
+        <w:tc>
+          <w:tcPr>
+            <w:tcW w:type="dxa" w:w="3105"/>
+            <w:vAlign w:val="center"/>
+          </w:tcPr>
+          <w:p>
+            <w:r/>
+            <w:r>
+              <w:rPr>
+                <w:rFonts w:ascii="宋体" w:hAnsi="宋体" w:eastAsia="宋体"/>
+                <w:b w:val="0"/>
+                <w:sz w:val="19"/>
+              </w:rPr>
+              <w:t>stdin 输入、stdout 汇编</w:t>
+            </w:r>
+          </w:p>
+        </w:tc>
+        <w:tc>
+          <w:tcPr>
+            <w:tcW w:type="dxa" w:w="3105"/>
+            <w:vAlign w:val="center"/>
+          </w:tcPr>
+          <w:p>
+            <w:r/>
+            <w:r>
+              <w:rPr>
+                <w:rFonts w:ascii="宋体" w:hAnsi="宋体" w:eastAsia="宋体"/>
+                <w:b w:val="0"/>
+                <w:sz w:val="19"/>
+              </w:rPr>
+              <w:t>main 读取流并调用 CodeGen 或常量专用汇编生成器</w:t>
+            </w:r>
+          </w:p>
+        </w:tc>
+        <w:tc>
+          <w:tcPr>
+            <w:tcW w:type="dxa" w:w="3105"/>
+            <w:vAlign w:val="center"/>
+          </w:tcPr>
+          <w:p>
+            <w:r/>
+            <w:r>
+              <w:rPr>
+                <w:rFonts w:ascii="宋体" w:hAnsi="宋体" w:eastAsia="宋体"/>
+                <w:b w:val="0"/>
+                <w:sz w:val="19"/>
+              </w:rPr>
+              <w:t>三个仓库样例</w:t>
+            </w:r>
+          </w:p>
+        </w:tc>
+      </w:tr>
+      <w:tr>
+        <w:tc>
+          <w:tcPr>
+            <w:tcW w:type="dxa" w:w="3105"/>
+            <w:vAlign w:val="center"/>
+          </w:tcPr>
+          <w:p>
+            <w:r/>
+            <w:r>
+              <w:rPr>
+                <w:rFonts w:ascii="宋体" w:hAnsi="宋体" w:eastAsia="宋体"/>
+                <w:b w:val="0"/>
+                <w:sz w:val="19"/>
+              </w:rPr>
+              <w:t>32 位 int 与常量初始化</w:t>
+            </w:r>
+          </w:p>
+        </w:tc>
+        <w:tc>
+          <w:tcPr>
+            <w:tcW w:type="dxa" w:w="3105"/>
+            <w:vAlign w:val="center"/>
+          </w:tcPr>
+          <w:p>
+            <w:r/>
+            <w:r>
+              <w:rPr>
+                <w:rFonts w:ascii="宋体" w:hAnsi="宋体" w:eastAsia="宋体"/>
+                <w:b w:val="0"/>
+                <w:sz w:val="19"/>
+              </w:rPr>
+              <w:t>wrap32、常量环境、RV32 指令</w:t>
+            </w:r>
+          </w:p>
+        </w:tc>
+        <w:tc>
+          <w:tcPr>
+            <w:tcW w:type="dxa" w:w="3105"/>
+            <w:vAlign w:val="center"/>
+          </w:tcPr>
+          <w:p>
+            <w:r/>
+            <w:r>
+              <w:rPr>
+                <w:rFonts w:ascii="宋体" w:hAnsi="宋体" w:eastAsia="宋体"/>
+                <w:b w:val="0"/>
+                <w:sz w:val="19"/>
+              </w:rPr>
+              <w:t>边界差分</w:t>
+            </w:r>
+          </w:p>
+        </w:tc>
+      </w:tr>
+      <w:tr>
+        <w:tc>
+          <w:tcPr>
+            <w:tcW w:type="dxa" w:w="3105"/>
+            <w:vAlign w:val="center"/>
+          </w:tcPr>
+          <w:p>
+            <w:r/>
+            <w:r>
+              <w:rPr>
+                <w:rFonts w:ascii="宋体" w:hAnsi="宋体" w:eastAsia="宋体"/>
+                <w:b w:val="0"/>
+                <w:sz w:val="19"/>
+              </w:rPr>
+              <w:t>块作用域与同名屏蔽</w:t>
+            </w:r>
+          </w:p>
+        </w:tc>
+        <w:tc>
+          <w:tcPr>
+            <w:tcW w:type="dxa" w:w="3105"/>
+            <w:vAlign w:val="center"/>
+          </w:tcPr>
+          <w:p>
+            <w:r/>
+            <w:r>
+              <w:rPr>
+                <w:rFonts w:ascii="宋体" w:hAnsi="宋体" w:eastAsia="宋体"/>
+                <w:b w:val="0"/>
+                <w:sz w:val="19"/>
+              </w:rPr>
+              <w:t>嵌套符号表、shadow DCE guard</w:t>
+            </w:r>
+          </w:p>
+        </w:tc>
+        <w:tc>
+          <w:tcPr>
+            <w:tcW w:type="dxa" w:w="3105"/>
+            <w:vAlign w:val="center"/>
+          </w:tcPr>
+          <w:p>
+            <w:r/>
+            <w:r>
+              <w:rPr>
+                <w:rFonts w:ascii="宋体" w:hAnsi="宋体" w:eastAsia="宋体"/>
+                <w:b w:val="0"/>
+                <w:sz w:val="19"/>
+              </w:rPr>
+              <w:t>114 个 shadow 回归</w:t>
+            </w:r>
+          </w:p>
+        </w:tc>
+      </w:tr>
+      <w:tr>
+        <w:tc>
+          <w:tcPr>
+            <w:tcW w:type="dxa" w:w="3105"/>
+            <w:vAlign w:val="center"/>
+          </w:tcPr>
+          <w:p>
+            <w:r/>
+            <w:r>
+              <w:rPr>
+                <w:rFonts w:ascii="宋体" w:hAnsi="宋体" w:eastAsia="宋体"/>
+                <w:b w:val="0"/>
+                <w:sz w:val="19"/>
+              </w:rPr>
+              <w:t>if/while/break/continue</w:t>
+            </w:r>
+          </w:p>
+        </w:tc>
+        <w:tc>
+          <w:tcPr>
+            <w:tcW w:type="dxa" w:w="3105"/>
+            <w:vAlign w:val="center"/>
+          </w:tcPr>
+          <w:p>
+            <w:r/>
+            <w:r>
+              <w:rPr>
+                <w:rFonts w:ascii="宋体" w:hAnsi="宋体" w:eastAsia="宋体"/>
+                <w:b w:val="0"/>
+                <w:sz w:val="19"/>
+              </w:rPr>
+              <w:t>标签栈和直接条件分支</w:t>
+            </w:r>
+          </w:p>
+        </w:tc>
+        <w:tc>
+          <w:tcPr>
+            <w:tcW w:type="dxa" w:w="3105"/>
+            <w:vAlign w:val="center"/>
+          </w:tcPr>
+          <w:p>
+            <w:r/>
+            <w:r>
+              <w:rPr>
+                <w:rFonts w:ascii="宋体" w:hAnsi="宋体" w:eastAsia="宋体"/>
+                <w:b w:val="0"/>
+                <w:sz w:val="19"/>
+              </w:rPr>
+              <w:t>control.tc + 随机程序</w:t>
+            </w:r>
+          </w:p>
+        </w:tc>
+      </w:tr>
+      <w:tr>
+        <w:tc>
+          <w:tcPr>
+            <w:tcW w:type="dxa" w:w="3105"/>
+            <w:vAlign w:val="center"/>
+          </w:tcPr>
+          <w:p>
+            <w:r/>
+            <w:r>
+              <w:rPr>
+                <w:rFonts w:ascii="宋体" w:hAnsi="宋体" w:eastAsia="宋体"/>
+                <w:b w:val="0"/>
+                <w:sz w:val="19"/>
+              </w:rPr>
+              <w:t>int/void 函数与递归</w:t>
+            </w:r>
+          </w:p>
+        </w:tc>
+        <w:tc>
+          <w:tcPr>
+            <w:tcW w:type="dxa" w:w="3105"/>
+            <w:vAlign w:val="center"/>
+          </w:tcPr>
+          <w:p>
+            <w:r/>
+            <w:r>
+              <w:rPr>
+                <w:rFonts w:ascii="宋体" w:hAnsi="宋体" w:eastAsia="宋体"/>
+                <w:b w:val="0"/>
+                <w:sz w:val="19"/>
+              </w:rPr>
+              <w:t>函数表、ABI、尾调用转换</w:t>
+            </w:r>
+          </w:p>
+        </w:tc>
+        <w:tc>
+          <w:tcPr>
+            <w:tcW w:type="dxa" w:w="3105"/>
+            <w:vAlign w:val="center"/>
+          </w:tcPr>
+          <w:p>
+            <w:r/>
+            <w:r>
+              <w:rPr>
+                <w:rFonts w:ascii="宋体" w:hAnsi="宋体" w:eastAsia="宋体"/>
+                <w:b w:val="0"/>
+                <w:sz w:val="19"/>
+              </w:rPr>
+              <w:t>functions.tc</w:t>
+            </w:r>
+          </w:p>
+        </w:tc>
+      </w:tr>
+      <w:tr>
+        <w:tc>
+          <w:tcPr>
+            <w:tcW w:type="dxa" w:w="3105"/>
+            <w:vAlign w:val="center"/>
+          </w:tcPr>
+          <w:p>
+            <w:r/>
+            <w:r>
+              <w:rPr>
+                <w:rFonts w:ascii="宋体" w:hAnsi="宋体" w:eastAsia="宋体"/>
+                <w:b w:val="0"/>
+                <w:sz w:val="19"/>
+              </w:rPr>
+              <w:t>超过八个参数</w:t>
+            </w:r>
+          </w:p>
+        </w:tc>
+        <w:tc>
+          <w:tcPr>
+            <w:tcW w:type="dxa" w:w="3105"/>
+            <w:vAlign w:val="center"/>
+          </w:tcPr>
+          <w:p>
+            <w:r/>
+            <w:r>
+              <w:rPr>
+                <w:rFonts w:ascii="宋体" w:hAnsi="宋体" w:eastAsia="宋体"/>
+                <w:b w:val="0"/>
+                <w:sz w:val="19"/>
+              </w:rPr>
+              <w:t>a0-a7 + 调用者栈</w:t>
+            </w:r>
+          </w:p>
+        </w:tc>
+        <w:tc>
+          <w:tcPr>
+            <w:tcW w:type="dxa" w:w="3105"/>
+            <w:vAlign w:val="center"/>
+          </w:tcPr>
+          <w:p>
+            <w:r/>
+            <w:r>
+              <w:rPr>
+                <w:rFonts w:ascii="宋体" w:hAnsi="宋体" w:eastAsia="宋体"/>
+                <w:b w:val="0"/>
+                <w:sz w:val="19"/>
+              </w:rPr>
+              <w:t>12/30/40 参数压力测试</w:t>
+            </w:r>
+          </w:p>
+        </w:tc>
+      </w:tr>
+    </w:tbl>
+    <w:p/>
+    <w:p>
+      <w:pPr>
+        <w:pStyle w:val="Heading2"/>
+      </w:pPr>
+      <w:r>
+        <w:t>7.3 在线评测</w:t>
+      </w:r>
+    </w:p>
+    <w:p>
+      <w:pPr/>
+      <w:r>
+        <w:t>2026-07-12 对提交 bd038e8 的最近一次完整有效评测中，30 个功能测试全部通过，功能分为 100。12 个性能点中 11 个达到 100%，p07_loop 为 5001ms、性能比例 4%，因此 OJ 评测分为 98.02。之后的 20752d6（热度寄存器分配）和 2dd0bb1（shadow DCE 修复）因评测服务器连接失败尚未取得完整新结果。该记录说明功能覆盖稳定，但不能把当前结果描述为已经满分。</w:t>
+      </w:r>
+    </w:p>
+    <w:p>
+      <w:pPr>
+        <w:pStyle w:val="Heading1"/>
+      </w:pPr>
+      <w:r>
+        <w:t>8. 构建与复现</w:t>
+      </w:r>
+    </w:p>
+    <w:p>
+      <w:pPr>
+        <w:spacing w:before="80" w:after="160"/>
+        <w:ind w:left="288" w:right="288"/>
+        <w:shd w:fill="F2F4F7"/>
+      </w:pPr>
+      <w:r>
+        <w:rPr>
+          <w:rFonts w:ascii="Consolas" w:hAnsi="Consolas" w:eastAsia="Consolas"/>
+          <w:sz w:val="18"/>
+        </w:rPr>
+        <w:t>make clean</w:t>
+        <w:br/>
+        <w:t>make</w:t>
+        <w:br/>
+        <w:t>make test</w:t>
+        <w:br/>
+        <w:t>./main &lt; tests/basic.tc &gt; basic.s</w:t>
+        <w:br/>
+        <w:t>./main -opt &lt; tests/control.tc &gt; control.s</w:t>
+        <w:br/>
+        <w:t>python3 tools/run_eval.py</w:t>
+      </w:r>
+    </w:p>
+    <w:p>
+      <w:pPr/>
+      <w:r>
+        <w:t>编译器只从 stdin 读取 ToyC，只向 stdout 输出汇编；诊断信息使用stderr，符合评测接口约定。</w:t>
+      </w:r>
+    </w:p>
+    <w:p>
+      <w:pPr>
+        <w:pStyle w:val="Heading1"/>
+      </w:pPr>
+      <w:r>
+        <w:t>9. 问题分析与解决</w:t>
       </w:r>
     </w:p>
     <w:p>
@@ -325,11 +1698,7 @@
         <w:pStyle w:val="ListNumber"/>
       </w:pPr>
       <w:r>
-        <w:rPr>
-          <w:rFonts w:ascii="Calibri" w:hAnsi="Calibri" w:eastAsia="Calibri"/>
-          <w:sz w:val="21"/>
-        </w:rPr>
-        <w:t>逻辑或表达式。</w:t>
+        <w:t>多参数调用：前八个参数与栈上传参必须同时保持求值结果，最终通过统一的调用者临时区和对齐策略解决。</w:t>
       </w:r>
     </w:p>
     <w:p>
@@ -337,11 +1706,7 @@
         <w:pStyle w:val="ListNumber"/>
       </w:pPr>
       <w:r>
-        <w:rPr>
-          <w:rFonts w:ascii="Calibri" w:hAnsi="Calibri" w:eastAsia="Calibri"/>
-          <w:sz w:val="21"/>
-        </w:rPr>
-        <w:t>逻辑与表达式。</w:t>
+        <w:t>短路副作用：不能把 &amp;&amp;/|| 当普通二元运算，最终以真假标签递归生成。</w:t>
       </w:r>
     </w:p>
     <w:p>
@@ -349,11 +1714,7 @@
         <w:pStyle w:val="ListNumber"/>
       </w:pPr>
       <w:r>
-        <w:rPr>
-          <w:rFonts w:ascii="Calibri" w:hAnsi="Calibri" w:eastAsia="Calibri"/>
-          <w:sz w:val="21"/>
-        </w:rPr>
-        <w:t>关系和相等性表达式。</w:t>
+        <w:t>大循环：逐轮解释无法满足性能要求，最终增加带证明门槛的矩阵、周期和状态摘要，并保留失败回退。</w:t>
       </w:r>
     </w:p>
     <w:p>
@@ -361,11 +1722,7 @@
         <w:pStyle w:val="ListNumber"/>
       </w:pPr>
       <w:r>
-        <w:rPr>
-          <w:rFonts w:ascii="Calibri" w:hAnsi="Calibri" w:eastAsia="Calibri"/>
-          <w:sz w:val="21"/>
-        </w:rPr>
-        <w:t>加减表达式。</w:t>
+        <w:t>除模优化：magic-number 序列必须处理负被除数和 INT_MIN 边界，使用随机与边界差分验证商和余数。</w:t>
       </w:r>
     </w:p>
     <w:p>
@@ -373,41 +1730,7 @@
         <w:pStyle w:val="ListNumber"/>
       </w:pPr>
       <w:r>
-        <w:rPr>
-          <w:rFonts w:ascii="Calibri" w:hAnsi="Calibri" w:eastAsia="Calibri"/>
-          <w:sz w:val="21"/>
-        </w:rPr>
-        <w:t>乘除模表达式。</w:t>
-      </w:r>
-    </w:p>
-    <w:p>
-      <w:pPr>
-        <w:pStyle w:val="ListNumber"/>
-      </w:pPr>
-      <w:r>
-        <w:rPr>
-          <w:rFonts w:ascii="Calibri" w:hAnsi="Calibri" w:eastAsia="Calibri"/>
-          <w:sz w:val="21"/>
-        </w:rPr>
-        <w:t>一元表达式。</w:t>
-      </w:r>
-    </w:p>
-    <w:p>
-      <w:pPr>
-        <w:pStyle w:val="ListNumber"/>
-      </w:pPr>
-      <w:r>
-        <w:rPr>
-          <w:rFonts w:ascii="Calibri" w:hAnsi="Calibri" w:eastAsia="Calibri"/>
-          <w:sz w:val="21"/>
-        </w:rPr>
-        <w:t>基本表达式。</w:t>
-      </w:r>
-    </w:p>
-    <w:p>
-      <w:pPr/>
-      <w:r>
-        <w:t>这种结构直接对应 ToyC 文法，便于处理运算符优先级和左结合性。</w:t>
+        <w:t>作用域屏蔽：名称式 DCE 会混淆不同 binding，最终在证明条件不足时禁用该局部变换，优先保证语义正确。</w:t>
       </w:r>
     </w:p>
     <w:p>
@@ -415,13 +1738,295 @@
         <w:pStyle w:val="Heading1"/>
       </w:pPr>
       <w:r>
-        <w:t>5. 语义处理</w:t>
+        <w:t>10. 小组分工</w:t>
       </w:r>
     </w:p>
+    <w:tbl>
+      <w:tblPr>
+        <w:tblStyle w:val="TableGrid"/>
+        <w:tblW w:type="auto" w:w="0"/>
+        <w:jc w:val="center"/>
+        <w:tblLook w:firstColumn="1" w:firstRow="1" w:lastColumn="0" w:lastRow="0" w:noHBand="0" w:noVBand="1" w:val="04A0"/>
+      </w:tblPr>
+      <w:tblGrid>
+        <w:gridCol w:w="3105"/>
+        <w:gridCol w:w="3105"/>
+        <w:gridCol w:w="3105"/>
+      </w:tblGrid>
+      <w:tr>
+        <w:tc>
+          <w:tcPr>
+            <w:tcW w:type="dxa" w:w="3105"/>
+            <w:shd w:fill="D9EAF7"/>
+            <w:vAlign w:val="center"/>
+          </w:tcPr>
+          <w:p>
+            <w:r/>
+            <w:r>
+              <w:rPr>
+                <w:rFonts w:ascii="宋体" w:hAnsi="宋体" w:eastAsia="宋体"/>
+                <w:b/>
+                <w:sz w:val="19"/>
+              </w:rPr>
+              <w:t>成员</w:t>
+            </w:r>
+          </w:p>
+        </w:tc>
+        <w:tc>
+          <w:tcPr>
+            <w:tcW w:type="dxa" w:w="3105"/>
+            <w:shd w:fill="D9EAF7"/>
+            <w:vAlign w:val="center"/>
+          </w:tcPr>
+          <w:p>
+            <w:r/>
+            <w:r>
+              <w:rPr>
+                <w:rFonts w:ascii="宋体" w:hAnsi="宋体" w:eastAsia="宋体"/>
+                <w:b/>
+                <w:sz w:val="19"/>
+              </w:rPr>
+              <w:t>学号</w:t>
+            </w:r>
+          </w:p>
+        </w:tc>
+        <w:tc>
+          <w:tcPr>
+            <w:tcW w:type="dxa" w:w="3105"/>
+            <w:shd w:fill="D9EAF7"/>
+            <w:vAlign w:val="center"/>
+          </w:tcPr>
+          <w:p>
+            <w:r/>
+            <w:r>
+              <w:rPr>
+                <w:rFonts w:ascii="宋体" w:hAnsi="宋体" w:eastAsia="宋体"/>
+                <w:b/>
+                <w:sz w:val="19"/>
+              </w:rPr>
+              <w:t>主要工作</w:t>
+            </w:r>
+          </w:p>
+        </w:tc>
+      </w:tr>
+      <w:tr>
+        <w:tc>
+          <w:tcPr>
+            <w:tcW w:type="dxa" w:w="3105"/>
+            <w:vAlign w:val="center"/>
+          </w:tcPr>
+          <w:p>
+            <w:r/>
+            <w:r>
+              <w:rPr>
+                <w:rFonts w:ascii="宋体" w:hAnsi="宋体" w:eastAsia="宋体"/>
+                <w:b w:val="0"/>
+                <w:sz w:val="19"/>
+              </w:rPr>
+              <w:t>【填写】</w:t>
+            </w:r>
+          </w:p>
+        </w:tc>
+        <w:tc>
+          <w:tcPr>
+            <w:tcW w:type="dxa" w:w="3105"/>
+            <w:vAlign w:val="center"/>
+          </w:tcPr>
+          <w:p>
+            <w:r/>
+            <w:r>
+              <w:rPr>
+                <w:rFonts w:ascii="宋体" w:hAnsi="宋体" w:eastAsia="宋体"/>
+                <w:b w:val="0"/>
+                <w:sz w:val="19"/>
+              </w:rPr>
+              <w:t>【填写】</w:t>
+            </w:r>
+          </w:p>
+        </w:tc>
+        <w:tc>
+          <w:tcPr>
+            <w:tcW w:type="dxa" w:w="3105"/>
+            <w:vAlign w:val="center"/>
+          </w:tcPr>
+          <w:p>
+            <w:r/>
+            <w:r>
+              <w:rPr>
+                <w:rFonts w:ascii="宋体" w:hAnsi="宋体" w:eastAsia="宋体"/>
+                <w:b w:val="0"/>
+                <w:sz w:val="19"/>
+              </w:rPr>
+              <w:t>词法/语法分析与 AST</w:t>
+            </w:r>
+          </w:p>
+        </w:tc>
+      </w:tr>
+      <w:tr>
+        <w:tc>
+          <w:tcPr>
+            <w:tcW w:type="dxa" w:w="3105"/>
+            <w:vAlign w:val="center"/>
+          </w:tcPr>
+          <w:p>
+            <w:r/>
+            <w:r>
+              <w:rPr>
+                <w:rFonts w:ascii="宋体" w:hAnsi="宋体" w:eastAsia="宋体"/>
+                <w:b w:val="0"/>
+                <w:sz w:val="19"/>
+              </w:rPr>
+              <w:t>【填写】</w:t>
+            </w:r>
+          </w:p>
+        </w:tc>
+        <w:tc>
+          <w:tcPr>
+            <w:tcW w:type="dxa" w:w="3105"/>
+            <w:vAlign w:val="center"/>
+          </w:tcPr>
+          <w:p>
+            <w:r/>
+            <w:r>
+              <w:rPr>
+                <w:rFonts w:ascii="宋体" w:hAnsi="宋体" w:eastAsia="宋体"/>
+                <w:b w:val="0"/>
+                <w:sz w:val="19"/>
+              </w:rPr>
+              <w:t>【填写】</w:t>
+            </w:r>
+          </w:p>
+        </w:tc>
+        <w:tc>
+          <w:tcPr>
+            <w:tcW w:type="dxa" w:w="3105"/>
+            <w:vAlign w:val="center"/>
+          </w:tcPr>
+          <w:p>
+            <w:r/>
+            <w:r>
+              <w:rPr>
+                <w:rFonts w:ascii="宋体" w:hAnsi="宋体" w:eastAsia="宋体"/>
+                <w:b w:val="0"/>
+                <w:sz w:val="19"/>
+              </w:rPr>
+              <w:t>语义、作用域与中端优化</w:t>
+            </w:r>
+          </w:p>
+        </w:tc>
+      </w:tr>
+      <w:tr>
+        <w:tc>
+          <w:tcPr>
+            <w:tcW w:type="dxa" w:w="3105"/>
+            <w:vAlign w:val="center"/>
+          </w:tcPr>
+          <w:p>
+            <w:r/>
+            <w:r>
+              <w:rPr>
+                <w:rFonts w:ascii="宋体" w:hAnsi="宋体" w:eastAsia="宋体"/>
+                <w:b w:val="0"/>
+                <w:sz w:val="19"/>
+              </w:rPr>
+              <w:t>【填写】</w:t>
+            </w:r>
+          </w:p>
+        </w:tc>
+        <w:tc>
+          <w:tcPr>
+            <w:tcW w:type="dxa" w:w="3105"/>
+            <w:vAlign w:val="center"/>
+          </w:tcPr>
+          <w:p>
+            <w:r/>
+            <w:r>
+              <w:rPr>
+                <w:rFonts w:ascii="宋体" w:hAnsi="宋体" w:eastAsia="宋体"/>
+                <w:b w:val="0"/>
+                <w:sz w:val="19"/>
+              </w:rPr>
+              <w:t>【填写】</w:t>
+            </w:r>
+          </w:p>
+        </w:tc>
+        <w:tc>
+          <w:tcPr>
+            <w:tcW w:type="dxa" w:w="3105"/>
+            <w:vAlign w:val="center"/>
+          </w:tcPr>
+          <w:p>
+            <w:r/>
+            <w:r>
+              <w:rPr>
+                <w:rFonts w:ascii="宋体" w:hAnsi="宋体" w:eastAsia="宋体"/>
+                <w:b w:val="0"/>
+                <w:sz w:val="19"/>
+              </w:rPr>
+              <w:t>RISC-V32 后端与 ABI</w:t>
+            </w:r>
+          </w:p>
+        </w:tc>
+      </w:tr>
+      <w:tr>
+        <w:tc>
+          <w:tcPr>
+            <w:tcW w:type="dxa" w:w="3105"/>
+            <w:vAlign w:val="center"/>
+          </w:tcPr>
+          <w:p>
+            <w:r/>
+            <w:r>
+              <w:rPr>
+                <w:rFonts w:ascii="宋体" w:hAnsi="宋体" w:eastAsia="宋体"/>
+                <w:b w:val="0"/>
+                <w:sz w:val="19"/>
+              </w:rPr>
+              <w:t>【填写】</w:t>
+            </w:r>
+          </w:p>
+        </w:tc>
+        <w:tc>
+          <w:tcPr>
+            <w:tcW w:type="dxa" w:w="3105"/>
+            <w:vAlign w:val="center"/>
+          </w:tcPr>
+          <w:p>
+            <w:r/>
+            <w:r>
+              <w:rPr>
+                <w:rFonts w:ascii="宋体" w:hAnsi="宋体" w:eastAsia="宋体"/>
+                <w:b w:val="0"/>
+                <w:sz w:val="19"/>
+              </w:rPr>
+              <w:t>【填写】</w:t>
+            </w:r>
+          </w:p>
+        </w:tc>
+        <w:tc>
+          <w:tcPr>
+            <w:tcW w:type="dxa" w:w="3105"/>
+            <w:vAlign w:val="center"/>
+          </w:tcPr>
+          <w:p>
+            <w:r/>
+            <w:r>
+              <w:rPr>
+                <w:rFonts w:ascii="宋体" w:hAnsi="宋体" w:eastAsia="宋体"/>
+                <w:b w:val="0"/>
+                <w:sz w:val="19"/>
+              </w:rPr>
+              <w:t>测试、性能分析与报告</w:t>
+            </w:r>
+          </w:p>
+        </w:tc>
+      </w:tr>
+    </w:tbl>
+    <w:p/>
     <w:p>
       <w:pPr/>
       <w:r>
-        <w:t>编译器维护嵌套作用域符号表，用于区分局部变量、全局变量和常量。常量声明会在编译期求值，后续引用直接替换成立即数。局部变量和函数形参分配在函数栈帧中，全局变量分配在 .data 段。</w:t>
+        <w:t>以上分工必须由小组按真实贡献在提交前确认，不能由代码仓库推断或代填。</w:t>
       </w:r>
     </w:p>
     <w:p>
@@ -429,231 +2034,42 @@
         <w:pStyle w:val="Heading1"/>
       </w:pPr>
       <w:r>
-        <w:t>6. 代码生成</w:t>
+        <w:t>11. 总结与后续工作</w:t>
       </w:r>
     </w:p>
     <w:p>
       <w:pPr/>
       <w:r>
-        <w:t>代码生成目标为 RISC-V32 汇编。每个函数建立独立栈帧：</w:t>
-      </w:r>
-    </w:p>
-    <w:p>
-      <w:pPr>
-        <w:pStyle w:val="ListBullet"/>
-      </w:pPr>
-      <w:r>
-        <w:rPr>
-          <w:rFonts w:ascii="Calibri" w:hAnsi="Calibri" w:eastAsia="Calibri"/>
-          <w:sz w:val="21"/>
-        </w:rPr>
-        <w:t>ra 和旧 s0 保存在栈帧顶部。</w:t>
-      </w:r>
-    </w:p>
-    <w:p>
-      <w:pPr>
-        <w:pStyle w:val="ListBullet"/>
-      </w:pPr>
-      <w:r>
-        <w:rPr>
-          <w:rFonts w:ascii="Calibri" w:hAnsi="Calibri" w:eastAsia="Calibri"/>
-          <w:sz w:val="21"/>
-        </w:rPr>
-        <w:t>s0 作为帧指针。</w:t>
-      </w:r>
-    </w:p>
-    <w:p>
-      <w:pPr>
-        <w:pStyle w:val="ListBullet"/>
-      </w:pPr>
-      <w:r>
-        <w:rPr>
-          <w:rFonts w:ascii="Calibri" w:hAnsi="Calibri" w:eastAsia="Calibri"/>
-          <w:sz w:val="21"/>
-        </w:rPr>
-        <w:t>参数和局部变量使用相对 s0 的偏移访问。</w:t>
-      </w:r>
-    </w:p>
-    <w:p>
-      <w:pPr>
-        <w:pStyle w:val="ListBullet"/>
-      </w:pPr>
-      <w:r>
-        <w:rPr>
-          <w:rFonts w:ascii="Calibri" w:hAnsi="Calibri" w:eastAsia="Calibri"/>
-          <w:sz w:val="21"/>
-        </w:rPr>
-        <w:t>表达式结果统一放入 a0。</w:t>
-      </w:r>
-    </w:p>
-    <w:p>
-      <w:pPr/>
-      <w:r>
-        <w:t>函数调用按照 RISC-V 调用习惯处理，前八个参数放入 a0 到 a7，更多参数放到调用者栈上。</w:t>
-      </w:r>
-    </w:p>
-    <w:p>
-      <w:pPr>
-        <w:pStyle w:val="Heading1"/>
-      </w:pPr>
-      <w:r>
-        <w:t>7. 控制流</w:t>
-      </w:r>
-    </w:p>
-    <w:p>
-      <w:pPr/>
-      <w:r>
-        <w:t>if-else 和 while 使用自动生成的局部标签和条件跳转实现。break 跳转到当前循环结束标签，continue 跳转到当前循环条件判断标签。逻辑与和逻辑或使用短路求值生成，不会无条件计算右侧表达式。</w:t>
-      </w:r>
-    </w:p>
-    <w:p>
-      <w:pPr>
-        <w:pStyle w:val="Heading1"/>
-      </w:pPr>
-      <w:r>
-        <w:t>8. 优化实现</w:t>
-      </w:r>
-    </w:p>
-    <w:p>
-      <w:pPr/>
-      <w:r>
-        <w:t>当前实现以功能正确性为优先目标，同时实现了常量表达式折叠和部分立即数加减法优化。常量表达式在编译阶段求值，可以减少运行时指令数量；常见的变量加减小立即数会生成 addi 指令，避免不必要的压栈和二元运算序列。</w:t>
-      </w:r>
-    </w:p>
-    <w:p>
-      <w:pPr>
-        <w:pStyle w:val="Heading1"/>
-      </w:pPr>
-      <w:r>
-        <w:t>9. 测试</w:t>
-      </w:r>
-    </w:p>
-    <w:p>
-      <w:pPr/>
-      <w:r>
-        <w:t>项目包含三个基础测试：</w:t>
-      </w:r>
-    </w:p>
-    <w:p>
-      <w:pPr>
-        <w:pStyle w:val="ListBullet"/>
-      </w:pPr>
-      <w:r>
-        <w:rPr>
-          <w:rFonts w:ascii="Calibri" w:hAnsi="Calibri" w:eastAsia="Calibri"/>
-          <w:sz w:val="21"/>
-        </w:rPr>
-        <w:t>tests/basic.tc：测试全局变量、常量、算术表达式。</w:t>
-      </w:r>
-    </w:p>
-    <w:p>
-      <w:pPr>
-        <w:pStyle w:val="ListBullet"/>
-      </w:pPr>
-      <w:r>
-        <w:rPr>
-          <w:rFonts w:ascii="Calibri" w:hAnsi="Calibri" w:eastAsia="Calibri"/>
-          <w:sz w:val="21"/>
-        </w:rPr>
-        <w:t>tests/control.tc：测试循环、分支、break、continue 和逻辑表达式。</w:t>
-      </w:r>
-    </w:p>
-    <w:p>
-      <w:pPr>
-        <w:pStyle w:val="ListBullet"/>
-      </w:pPr>
-      <w:r>
-        <w:rPr>
-          <w:rFonts w:ascii="Calibri" w:hAnsi="Calibri" w:eastAsia="Calibri"/>
-          <w:sz w:val="21"/>
-        </w:rPr>
-        <w:t>tests/functions.tc：测试递归函数和超过八个参数的函数调用。</w:t>
-      </w:r>
-    </w:p>
-    <w:p>
-      <w:pPr/>
-      <w:r>
-        <w:t>本地使用 make clean &amp;&amp; make &amp;&amp; make test 完成构建和样例汇编生成验证。</w:t>
-      </w:r>
-    </w:p>
-    <w:p>
-      <w:pPr>
-        <w:pStyle w:val="Heading1"/>
-      </w:pPr>
-      <w:r>
-        <w:t>10. 后续优化方向</w:t>
-      </w:r>
-    </w:p>
-    <w:p>
-      <w:pPr>
-        <w:pStyle w:val="ListBullet"/>
-      </w:pPr>
-      <w:r>
-        <w:rPr>
-          <w:rFonts w:ascii="Calibri" w:hAnsi="Calibri" w:eastAsia="Calibri"/>
-          <w:sz w:val="21"/>
-        </w:rPr>
-        <w:t>更完整的常量传播。</w:t>
-      </w:r>
-    </w:p>
-    <w:p>
-      <w:pPr>
-        <w:pStyle w:val="ListBullet"/>
-      </w:pPr>
-      <w:r>
-        <w:rPr>
-          <w:rFonts w:ascii="Calibri" w:hAnsi="Calibri" w:eastAsia="Calibri"/>
-          <w:sz w:val="21"/>
-        </w:rPr>
-        <w:t>死代码删除。</w:t>
-      </w:r>
-    </w:p>
-    <w:p>
-      <w:pPr>
-        <w:pStyle w:val="ListBullet"/>
-      </w:pPr>
-      <w:r>
-        <w:rPr>
-          <w:rFonts w:ascii="Calibri" w:hAnsi="Calibri" w:eastAsia="Calibri"/>
-          <w:sz w:val="21"/>
-        </w:rPr>
-        <w:t>公共子表达式消除。</w:t>
-      </w:r>
-    </w:p>
-    <w:p>
-      <w:pPr>
-        <w:pStyle w:val="ListBullet"/>
-      </w:pPr>
-      <w:r>
-        <w:rPr>
-          <w:rFonts w:ascii="Calibri" w:hAnsi="Calibri" w:eastAsia="Calibri"/>
-          <w:sz w:val="21"/>
-        </w:rPr>
-        <w:t>更好的寄存器分配。</w:t>
-      </w:r>
-    </w:p>
-    <w:p>
-      <w:pPr>
-        <w:pStyle w:val="Heading1"/>
-      </w:pPr>
-      <w:r>
-        <w:t>11. 总结</w:t>
-      </w:r>
-    </w:p>
-    <w:p>
-      <w:pPr/>
-      <w:r>
-        <w:t>本项目完成了 ToyC 编译器的基本前端和后端，实现了从源程序到 RISC-V32 汇编的完整编译流程。整体实现以正确性和可维护性为优先目标，为后续性能优化预留了空间。</w:t>
+        <w:t>项目已完成 ToyC 前端、语义处理、优化管线和 RISC-V32 后端，并通过全部在线功能测试。实现过程中坚持语义证明失败即回退，不使用外部编译器框架或隐藏用例特判。后续工作的重点是分析 p07_loop 未命中的循环转移形态，继续改进通用循环摘要和真实后端循环优化；同时应补充更多可复现的随机差分脚本，并由小组填写成员信息后提交最终报告。</w:t>
       </w:r>
     </w:p>
     <w:sectPr>
-      <w:pgSz w:w="12240" w:h="15840"/>
-      <w:pgMar w:top="1440" w:right="1440" w:bottom="1440" w:left="1440" w:header="708" w:footer="708" w:gutter="0"/>
+      <w:footerReference w:type="default" r:id="rId9"/>
+      <w:pgSz w:w="11906" w:h="16838"/>
+      <w:pgMar w:top="1224" w:right="1296" w:bottom="1224" w:left="1296" w:header="576" w:footer="576" w:gutter="0"/>
       <w:cols w:space="720"/>
       <w:docGrid w:linePitch="360"/>
     </w:sectPr>
   </w:body>
 </w:document>
+</file>
+
+<file path=word/footer1.xml><?xml version="1.0" encoding="utf-8"?>
+<w:ftr xmlns:m="http://schemas.openxmlformats.org/officeDocument/2006/math" xmlns:mc="http://schemas.openxmlformats.org/markup-compatibility/2006" xmlns:mo="http://schemas.microsoft.com/office/mac/office/2008/main" xmlns:mv="urn:schemas-microsoft-com:mac:vml" xmlns:o="urn:schemas-microsoft-com:office:office" xmlns:r="http://schemas.openxmlformats.org/officeDocument/2006/relationships" xmlns:v="urn:schemas-microsoft-com:vml" xmlns:w10="urn:schemas-microsoft-com:office:word" xmlns:w14="http://schemas.microsoft.com/office/word/2010/wordml" xmlns:w="http://schemas.openxmlformats.org/wordprocessingml/2006/main" xmlns:wne="http://schemas.microsoft.com/office/word/2006/wordml" xmlns:wp14="http://schemas.microsoft.com/office/word/2010/wordprocessingDrawing" xmlns:wp="http://schemas.openxmlformats.org/drawingml/2006/wordprocessingDrawing" xmlns:wpc="http://schemas.microsoft.com/office/word/2010/wordprocessingCanvas" xmlns:wpg="http://schemas.microsoft.com/office/word/2010/wordprocessingGroup" xmlns:wpi="http://schemas.microsoft.com/office/word/2010/wordprocessingInk" xmlns:wps="http://schemas.microsoft.com/office/word/2010/wordprocessingShape" mc:Ignorable="w14 wp14">
+  <w:p>
+    <w:pPr>
+      <w:pStyle w:val="Footer"/>
+      <w:jc w:val="center"/>
+    </w:pPr>
+    <w:r>
+      <w:t xml:space="preserve">第 </w:t>
+    </w:r>
+    <w:fldSimple w:instr="PAGE"/>
+    <w:r>
+      <w:t xml:space="preserve"> 页</w:t>
+    </w:r>
+  </w:p>
+</w:ftr>
 </file>
 
 <file path=word/numbering.xml><?xml version="1.0" encoding="utf-8"?>
@@ -1020,10 +2436,10 @@
     <w:qFormat/>
     <w:rsid w:val="00FC693F"/>
     <w:pPr>
-      <w:spacing w:before="0" w:after="120" w:line="264" w:lineRule="auto"/>
+      <w:spacing w:before="0" w:after="120" w:line="276" w:lineRule="auto"/>
     </w:pPr>
     <w:rPr>
-      <w:rFonts w:ascii="Calibri" w:hAnsi="Calibri" w:eastAsia="Calibri"/>
+      <w:rFonts w:ascii="宋体" w:hAnsi="宋体" w:eastAsia="宋体"/>
       <w:color w:val="000000"/>
       <w:sz w:val="21"/>
     </w:rPr>
@@ -1083,15 +2499,15 @@
     <w:pPr>
       <w:keepNext/>
       <w:keepLines/>
-      <w:spacing w:before="320" w:after="160" w:line="264" w:lineRule="auto"/>
+      <w:spacing w:before="280" w:after="140" w:line="264" w:lineRule="auto"/>
       <w:outlineLvl w:val="0"/>
     </w:pPr>
     <w:rPr>
-      <w:rFonts w:asciiTheme="majorHAnsi" w:eastAsiaTheme="majorEastAsia" w:hAnsiTheme="majorHAnsi" w:cstheme="majorBidi" w:ascii="Calibri" w:hAnsi="Calibri" w:eastAsia="Calibri"/>
+      <w:rFonts w:asciiTheme="majorHAnsi" w:eastAsiaTheme="majorEastAsia" w:hAnsiTheme="majorHAnsi" w:cstheme="majorBidi" w:ascii="黑体" w:hAnsi="黑体" w:eastAsia="黑体"/>
       <w:b/>
       <w:bCs/>
       <w:color w:val="2E74B5"/>
-      <w:sz w:val="32"/>
+      <w:sz w:val="30"/>
       <w:szCs w:val="28"/>
     </w:rPr>
   </w:style>
@@ -1107,15 +2523,15 @@
     <w:pPr>
       <w:keepNext/>
       <w:keepLines/>
-      <w:spacing w:before="240" w:after="120" w:line="264" w:lineRule="auto"/>
+      <w:spacing w:before="200" w:after="100" w:line="264" w:lineRule="auto"/>
       <w:outlineLvl w:val="1"/>
     </w:pPr>
     <w:rPr>
-      <w:rFonts w:asciiTheme="majorHAnsi" w:eastAsiaTheme="majorEastAsia" w:hAnsiTheme="majorHAnsi" w:cstheme="majorBidi" w:ascii="Calibri" w:hAnsi="Calibri" w:eastAsia="Calibri"/>
+      <w:rFonts w:asciiTheme="majorHAnsi" w:eastAsiaTheme="majorEastAsia" w:hAnsiTheme="majorHAnsi" w:cstheme="majorBidi" w:ascii="黑体" w:hAnsi="黑体" w:eastAsia="黑体"/>
       <w:b/>
       <w:bCs/>
       <w:color w:val="2E74B5"/>
-      <w:sz w:val="26"/>
+      <w:sz w:val="25"/>
       <w:szCs w:val="26"/>
     </w:rPr>
   </w:style>
@@ -1135,11 +2551,11 @@
       <w:outlineLvl w:val="2"/>
     </w:pPr>
     <w:rPr>
-      <w:rFonts w:asciiTheme="majorHAnsi" w:eastAsiaTheme="majorEastAsia" w:hAnsiTheme="majorHAnsi" w:cstheme="majorBidi" w:ascii="Calibri" w:hAnsi="Calibri" w:eastAsia="Calibri"/>
+      <w:rFonts w:asciiTheme="majorHAnsi" w:eastAsiaTheme="majorEastAsia" w:hAnsiTheme="majorHAnsi" w:cstheme="majorBidi" w:ascii="黑体" w:hAnsi="黑体" w:eastAsia="黑体"/>
       <w:b/>
       <w:bCs/>
       <w:color w:val="1F4D78"/>
-      <w:sz w:val="24"/>
+      <w:sz w:val="23"/>
     </w:rPr>
   </w:style>
   <w:style w:type="paragraph" w:styleId="Heading4">
@@ -1555,11 +2971,11 @@
       <w:numPr>
         <w:numId w:val="1"/>
       </w:numPr>
-      <w:spacing w:before="0" w:after="120" w:line="280" w:lineRule="auto"/>
+      <w:spacing w:before="0" w:after="60" w:line="264" w:lineRule="auto"/>
       <w:contextualSpacing/>
     </w:pPr>
     <w:rPr>
-      <w:rFonts w:ascii="Calibri" w:hAnsi="Calibri" w:eastAsia="Calibri"/>
+      <w:rFonts w:ascii="宋体" w:hAnsi="宋体" w:eastAsia="宋体"/>
       <w:color w:val="000000"/>
       <w:sz w:val="21"/>
     </w:rPr>
@@ -1600,11 +3016,11 @@
       <w:numPr>
         <w:numId w:val="5"/>
       </w:numPr>
-      <w:spacing w:before="0" w:after="120" w:line="280" w:lineRule="auto"/>
+      <w:spacing w:before="0" w:after="60" w:line="264" w:lineRule="auto"/>
       <w:contextualSpacing/>
     </w:pPr>
     <w:rPr>
-      <w:rFonts w:ascii="Calibri" w:hAnsi="Calibri" w:eastAsia="Calibri"/>
+      <w:rFonts w:ascii="宋体" w:hAnsi="宋体" w:eastAsia="宋体"/>
       <w:color w:val="000000"/>
       <w:sz w:val="21"/>
     </w:rPr>

</xml_diff>

<commit_message>
fix: preserve report line spacing
</commit_message>
<xml_diff>
--- a/docs/practice_report.docx
+++ b/docs/practice_report.docx
@@ -267,7 +267,7 @@
     <w:p>
       <w:pPr/>
       <w:r>
-        <w:t>本项目从零实现了一个 ToyC 到 RISC-V32 汇编的编译器。编译器从标准输入读取ToyC 源程序，经过词法分析、递归下降语法分析、AST 构造、作用域与语义信息维护、中端优化和后端代码生成，最终向标准输出写出可汇编执行的 RISC-V32程序。-opt 选择性能预算和调度顺序；默认模式也执行安全优化与有界求值。</w:t>
+        <w:t>本项目从零实现了一个 ToyC 到 RISC-V32 汇编的编译器。编译器从标准输入读取 ToyC 源程序，经过词法分析、递归下降语法分析、AST 构造、作用域与语义信息维护、中端优化和后端代码生成，最终向标准输出写出可汇编执行的 RISC-V32 程序。-opt 选择性能预算和调度顺序；默认模式也执行安全优化与有界求值。</w:t>
       </w:r>
     </w:p>
     <w:p>
@@ -417,7 +417,7 @@
     <w:p>
       <w:pPr/>
       <w:r>
-        <w:t>表达式解析按优先级分层：逻辑或、逻辑与、关系/相等、加减、乘除模、一元和基本表达式。每一层通过循环处理左结合运算符，从结构上保证优先级和结合性。语句解析覆盖声明、表达式、赋值、块、if-else、while、break、continue 和 return；顶层解析覆盖全局声明与函数定义。</w:t>
+        <w:t>表达式解析按优先级分层：逻辑或、逻辑与、关系/相等、加减、乘除模、一元和基本表达式。每一层通过循环处理左结合运算符，从结构上保证优先级和结合性。语句解析覆盖声明、表达式、赋值、块、if-else、while、break、 continue 和 return；顶层解析覆盖全局声明与函数定义。</w:t>
       </w:r>
     </w:p>
     <w:p>
@@ -541,7 +541,7 @@
     <w:p>
       <w:pPr/>
       <w:r>
-        <w:t>ToyC 没有输入、指针和 I/O，闭合程序的 main 返回值在语义上是确定的。性能模式先尝试有界部分求值：如果在预算内精确执行完成，则直接生成返回该值的RISC-V32 程序；如果遇到不支持的形态、资源上限或未在预算内结束，则放弃求值并进入正常后端，绝不猜测结果。</w:t>
+        <w:t>ToyC 没有输入、指针和 I/O，闭合程序的 main 返回值在语义上是确定的。性能模式先尝试有界部分求值：如果在预算内精确执行完成，则直接生成返回该值的 RISC-V32 程序；如果遇到不支持的形态、资源上限或未在预算内结束，则放弃求值并进入正常后端，绝不猜测结果。</w:t>
       </w:r>
     </w:p>
     <w:p>
@@ -635,7 +635,7 @@
     <w:p>
       <w:pPr/>
       <w:r>
-        <w:t>实现使用二进制快速幂计算 A^n，时间复杂度从逐轮执行的 O(n) 降到O(d^3 log n)（d 为状态维数）。只有当循环边界、归纳变量步长和所有状态更新都通过结构检查时才应用该公式。</w:t>
+        <w:t>实现使用二进制快速幂计算 A^n，时间复杂度从逐轮执行的 O(n) 降到 O(d^3 log n)（d 为状态维数）。只有当循环边界、归纳变量步长和所有状态更新都通过结构检查时才应用该公式。</w:t>
       </w:r>
     </w:p>
     <w:p>
@@ -725,7 +725,7 @@
     <w:p>
       <w:pPr/>
       <w:r>
-        <w:t>每个函数建立 16 字节对齐的独立栈帧，保存 ra、旧 s0 及实际使用的callee-saved 寄存器。s0 作为稳定帧指针。局部变量优先进入已分配寄存器，其余变量使用相对 s0 的独立槽位。全局变量通过标签寻址。</w:t>
+        <w:t>每个函数建立 16 字节对齐的独立栈帧，保存 ra、旧 s0 及实际使用的 callee-saved 寄存器。s0 作为稳定帧指针。局部变量优先进入已分配寄存器，其余变量使用相对 s0 的独立槽位。全局变量通过标签寻址。</w:t>
       </w:r>
     </w:p>
     <w:p>
@@ -781,7 +781,7 @@
     <w:p>
       <w:pPr/>
       <w:r>
-        <w:t>仓库提供 make test 和 tools/run_eval.py。make test 负责确认三个样例都能成功生成汇编，不等价于执行目标程序；端到端验证另外使用 GNUriscv64-linux-gnu-as/ld（RV32IM）与 qemu-riscv32 执行。基础用例覆盖全局/局部声明、表达式、控制流、递归和多参数调用。性能形状测试覆盖十亿级仿射循环、嵌套循环、周期分支和多参数函数。</w:t>
+        <w:t>仓库提供 make test 和 tools/run_eval.py。make test 负责确认三个样例都能成功生成汇编，不等价于执行目标程序；端到端验证另外使用 GNU riscv64-linux-gnu-as/ld（RV32IM）与 qemu-riscv32 执行。基础用例覆盖全局/局部声明、表达式、控制流、递归和多参数调用。性能形状测试覆盖十亿级仿射循环、嵌套循环、周期分支和多参数函数。</w:t>
       </w:r>
     </w:p>
     <w:p>
@@ -1234,7 +1234,7 @@
     <w:p>
       <w:pPr/>
       <w:r>
-        <w:t>上述扩展差分在开发环境执行，不是 OJ 构建依赖；所用汇编器为 GNU binutils2.44，执行器为 QEMU 10.0.8。参考结果来自等价 C 程序或独立的 32 位整数oracle，并比较完整返回值/退出码。</w:t>
+        <w:t>上述扩展差分在开发环境执行，不是 OJ 构建依赖；所用汇编器为 GNU binutils 2.44，执行器为 QEMU 10.0.8。参考结果来自等价 C 程序或独立的 32 位整数 oracle，并比较完整返回值/退出码。</w:t>
       </w:r>
     </w:p>
     <w:p>
@@ -1682,7 +1682,7 @@
     <w:p>
       <w:pPr/>
       <w:r>
-        <w:t>编译器只从 stdin 读取 ToyC，只向 stdout 输出汇编；诊断信息使用stderr，符合评测接口约定。</w:t>
+        <w:t>编译器只从 stdin 读取 ToyC，只向 stdout 输出汇编；诊断信息使用 stderr，符合评测接口约定。</w:t>
       </w:r>
     </w:p>
     <w:p>

</xml_diff>

<commit_message>
refactor: remove compile-time program execution
</commit_message>
<xml_diff>
--- a/docs/practice_report.docx
+++ b/docs/practice_report.docx
@@ -267,13 +267,13 @@
     <w:p>
       <w:pPr/>
       <w:r>
-        <w:t>本项目从零实现了一个 ToyC 到 RISC-V32 汇编的编译器。编译器从标准输入读取 ToyC 源程序，经过词法分析、递归下降语法分析、AST 构造、作用域与语义信息维护、中端优化和后端代码生成，最终向标准输出写出可汇编执行的 RISC-V32 程序。-opt 选择性能预算和调度顺序；默认模式也执行安全优化与有界求值。</w:t>
+        <w:t>本项目从零实现了一个 ToyC 到 RISC-V32 汇编的编译器。编译器从标准输入读取 ToyC 源程序，经过词法分析、递归下降语法分析、AST 构造、作用域与语义信息维护、中端优化和后端代码生成，最终向标准输出写出可汇编执行的 RISC-V32 程序。-opt 仅作为评测接口兼容参数；默认模式和优化模式都执行同一条静态分析与代码生成流水线。</w:t>
       </w:r>
     </w:p>
     <w:p>
       <w:pPr/>
       <w:r>
-        <w:t>实现没有调用 Clang、LLVM 或外部编译器框架。词法、语法、优化、求值器、字节码和 RISC-V32 后端均由项目代码自行实现，也没有按隐藏测试名称或固定源码文本/指纹进行特判。</w:t>
+        <w:t>实现没有调用 Clang、LLVM 或外部编译器框架。词法、语法、静态分析、优化和 RISC-V32 后端均由项目代码自行实现，也没有按隐藏测试名称或固定源码文本/指纹进行特判。</w:t>
       </w:r>
     </w:p>
     <w:p>
@@ -287,7 +287,7 @@
     <w:p>
       <w:pPr/>
       <w:r>
-        <w:t>主要实现集中在 src/main.cpp，构建入口为 Makefile。两个命令模式共享前端，但优化调度顺序不同：</w:t>
+        <w:t>主要实现集中在 src/main.cpp，构建入口为 Makefile。两个命令模式共享同一条静态编译流水线：</w:t>
       </w:r>
     </w:p>
     <w:p>
@@ -305,29 +305,25 @@
         <w:br/>
         <w:t xml:space="preserve">                         |</w:t>
         <w:br/>
-        <w:t xml:space="preserve">           +-------------+----------------+</w:t>
+        <w:t xml:space="preserve">             SafeOptimizer（局部证明）</w:t>
         <w:br/>
-        <w:t xml:space="preserve">           |                              |</w:t>
+        <w:t xml:space="preserve">                         |</w:t>
         <w:br/>
-        <w:t xml:space="preserve">        默认模式                        -opt 模式</w:t>
+        <w:t xml:space="preserve">       StaticAnalyzer（作用域/槽位/活跃性）</w:t>
         <w:br/>
-        <w:t xml:space="preserve"> SafeOptimizer                     快速 ConstEvaluator</w:t>
+        <w:t xml:space="preserve">                         |</w:t>
         <w:br/>
-        <w:t xml:space="preserve">      -&gt; ConstEvaluator                 -&gt; fresh FastEvaluator</w:t>
+        <w:t xml:space="preserve">       RangeAnalyzer（整数区间证明）</w:t>
         <w:br/>
-        <w:t xml:space="preserve">      -&gt; fresh FastEvaluator            -&gt; 失败时 SafeOptimizer/活跃性分析</w:t>
+        <w:t xml:space="preserve">                         |</w:t>
         <w:br/>
-        <w:t xml:space="preserve">      -&gt; 失败时 CodeGen                  -&gt; CodeGen</w:t>
-        <w:br/>
-        <w:t xml:space="preserve">           |                              |</w:t>
-        <w:br/>
-        <w:t xml:space="preserve">           +--------&gt; RISC-V32 汇编 &lt;-----+</w:t>
+        <w:t xml:space="preserve">                 CodeGen -&gt; RISC-V32 汇编</w:t>
       </w:r>
     </w:p>
     <w:p>
       <w:pPr/>
       <w:r>
-        <w:t>求值器可以在预算内成功并直接产生常量返回汇编，也可以无副作用地失败并回退；因此上图中的每条“失败时”边都属于正常控制流，而不是异常情况。</w:t>
+        <w:t>编译阶段只分析 AST 和表达式的静态性质，不调用 ToyC 的 main()，不解释执行语句或循环，也不生成“只返回预先算出常数”的替代程序。</w:t>
       </w:r>
     </w:p>
     <w:p>
@@ -357,7 +353,7 @@
         <w:pStyle w:val="ListBullet"/>
       </w:pPr>
       <w:r>
-        <w:t>ConstEvaluator：执行低成本常量求值，并对可证明的仿射循环进行摘要。</w:t>
+        <w:t>SafeOptimizer：进行常量表达式折叠、常量/拷贝传播、CSE、LICM、DCE 和常量控制流化简；只处理能够由 AST 局部证明的表达式。</w:t>
       </w:r>
     </w:p>
     <w:p>
@@ -365,7 +361,7 @@
         <w:pStyle w:val="ListBullet"/>
       </w:pPr>
       <w:r>
-        <w:t>FastEvaluator：把 AST 解析为带 slot 的字节码，执行更广的循环分析和有界部分求值。</w:t>
+        <w:t>StaticAnalyzer：解析词法绑定、分配局部槽位、记录运算符和循环编号，并做保守的向后活跃性分析。</w:t>
       </w:r>
     </w:p>
     <w:p>
@@ -373,7 +369,7 @@
         <w:pStyle w:val="ListBullet"/>
       </w:pPr>
       <w:r>
-        <w:t>SafeOptimizer：进行常量传播、拷贝传播、CSE、LICM、DCE 和常量控制流化简。</w:t>
+        <w:t>RangeAnalyzer：在分支和循环约束下推导整数区间，为后端安全选择除模指令。</w:t>
       </w:r>
     </w:p>
     <w:p>
@@ -445,7 +441,7 @@
     <w:p>
       <w:pPr/>
       <w:r>
-        <w:t>编译器维护嵌套作用域，正确区分全局变量、局部变量、形参和常量。块作用域支持同名屏蔽；变量声明点之前不可见。全局/局部常量在编译期求值，后续可作为立即数使用。全局可变对象放入 .data 段，局部对象进入寄存器或当前函数栈帧。</w:t>
+        <w:t>编译器维护嵌套作用域，正确区分全局变量、局部变量、形参和常量。块作用域支持同名屏蔽；变量声明点之前不可见。全局/局部常量表达式在 AST 上折叠，后续可作为立即数使用。全局可变对象放入 .data 段，局部对象进入寄存器或当前函数栈帧。</w:t>
       </w:r>
     </w:p>
     <w:p>
@@ -535,19 +531,19 @@
         <w:pStyle w:val="Heading2"/>
       </w:pPr>
       <w:r>
-        <w:t>5.2 有界全程序部分求值</w:t>
+        <w:t>5.2 静态数据流与范围分析</w:t>
       </w:r>
     </w:p>
     <w:p>
       <w:pPr/>
       <w:r>
-        <w:t>ToyC 没有输入、指针和 I/O，闭合程序的 main 返回值在语义上是确定的。性能模式先尝试有界部分求值：如果在预算内精确执行完成，则直接生成返回该值的 RISC-V32 程序；如果遇到不支持的形态、资源上限或未在预算内结束，则放弃求值并进入正常后端，绝不猜测结果。</w:t>
+        <w:t>StaticAnalyzer 为每个形参和局部声明分配稳定 slot，并把每个变量引用解析到具体 binding。向后活跃性分析只删除“后续绝不读取且右值无函数调用”的存储，遇到循环、break、continue 或分支时使用保守合并，证明不足就保留原代码。</w:t>
       </w:r>
     </w:p>
     <w:p>
       <w:pPr/>
       <w:r>
-        <w:t>FastEvaluator 使用自行定义的寄存器字节码。Linux x86-64 环境下可由项目自实现的机器码发射器加速字节码执行；其他环境仍保留通用回退路径。该机制不调用宿主 GCC/Clang，也不改变 ToyC 的可观察语义。</w:t>
+        <w:t>RangeAnalyzer 在 AST 上传播 [min,max] 区间，并用条件约束收窄循环归纳变量。它不运行循环，只为指令选择提供证明：例如只有在除数为已知非零常量、且被除数范围满足前提时，后端才使用移位或 magic-number 除模序列，否则生成普通指令。</w:t>
       </w:r>
     </w:p>
     <w:p>
@@ -555,87 +551,13 @@
         <w:pStyle w:val="Heading2"/>
       </w:pPr>
       <w:r>
-        <w:t>5.3 循环摘要</w:t>
+        <w:t>5.3 后端代码优化</w:t>
       </w:r>
     </w:p>
     <w:p>
       <w:pPr/>
       <w:r>
-        <w:t>逐次执行大循环代价较高，因此求值器在严格形状检查后尝试摘要：</w:t>
-      </w:r>
-    </w:p>
-    <w:p>
-      <w:pPr>
-        <w:pStyle w:val="ListBullet"/>
-      </w:pPr>
-      <w:r>
-        <w:t>仿射状态转移使用增广矩阵和快速幂一次计算多轮结果。</w:t>
-      </w:r>
-    </w:p>
-    <w:p>
-      <w:pPr>
-        <w:pStyle w:val="ListBullet"/>
-      </w:pPr>
-      <w:r>
-        <w:t>矩形嵌套循环在边界和状态转移满足约束时合并处理。</w:t>
-      </w:r>
-    </w:p>
-    <w:p>
-      <w:pPr>
-        <w:pStyle w:val="ListBullet"/>
-      </w:pPr>
-      <w:r>
-        <w:t>周期分支按模数相位构造转移并合并完整周期。</w:t>
-      </w:r>
-    </w:p>
-    <w:p>
-      <w:pPr>
-        <w:pStyle w:val="ListBullet"/>
-      </w:pPr>
-      <w:r>
-        <w:t>多项式累加、有限状态周期和部分线性递推使用独立的保守分析器。</w:t>
-      </w:r>
-    </w:p>
-    <w:p>
-      <w:pPr>
-        <w:pStyle w:val="ListBullet"/>
-      </w:pPr>
-      <w:r>
-        <w:t>纯 helper 只有在无全局副作用、实参求值和返回路径均可证明时才内联/摘要。</w:t>
-      </w:r>
-    </w:p>
-    <w:p>
-      <w:pPr/>
-      <w:r>
-        <w:t>每个分析器均有节点数、状态数、周期长度和工作量上限；证明失败立即回退，因此优化不会扩大语言语义范围。</w:t>
-      </w:r>
-    </w:p>
-    <w:p>
-      <w:pPr/>
-      <w:r>
-        <w:t>以仿射循环为例，将常数项并入增广状态后可写成：</w:t>
-      </w:r>
-    </w:p>
-    <w:p>
-      <w:pPr>
-        <w:spacing w:before="80" w:after="160"/>
-        <w:ind w:left="288" w:right="288"/>
-        <w:shd w:fill="F2F4F7"/>
-      </w:pPr>
-      <w:r>
-        <w:rPr>
-          <w:rFonts w:ascii="Consolas" w:hAnsi="Consolas" w:eastAsia="Consolas"/>
-          <w:sz w:val="18"/>
-        </w:rPr>
-        <w:t>state(k + 1) = A * state(k)  (mod 2^32)</w:t>
-        <w:br/>
-        <w:t>state(n)     = A^n * state(0)</w:t>
-      </w:r>
-    </w:p>
-    <w:p>
-      <w:pPr/>
-      <w:r>
-        <w:t>实现使用二进制快速幂计算 A^n，时间复杂度从逐轮执行的 O(n) 降到 O(d^3 log n)（d 为状态维数）。只有当循环边界、归纳变量步长和所有状态更新都通过结构检查时才应用该公式。</w:t>
+        <w:t>代码生成阶段根据静态信息选择寄存器和指令：循环深度加权的 slot 优先进入 callee-saved 寄存器；无调用表达式直接在寄存器中组合；关系条件直接转为分支；小函数在满足结构和副作用条件时内联；尾递归自调用改写为参数更新和回跳。这些变换只改变 RISC-V 指令布局，不改变程序的运行时入口或返回语义。</w:t>
       </w:r>
     </w:p>
     <w:p>
@@ -781,7 +703,7 @@
     <w:p>
       <w:pPr/>
       <w:r>
-        <w:t>仓库提供 make test 和 tools/run_eval.py。make test 负责确认三个样例都能成功生成汇编，不等价于执行目标程序；端到端验证另外使用 GNU riscv64-linux-gnu-as/ld（RV32IM）与 qemu-riscv32 执行。基础用例覆盖全局/局部声明、表达式、控制流、递归和多参数调用。性能形状测试覆盖十亿级仿射循环、嵌套循环、周期分支和多参数函数。</w:t>
+        <w:t>仓库提供 make test、make check 和 tools/run_eval.py。make check 还会检查大循环生成的汇编保留运行时控制流和完整函数结构；端到端验证另外使用 GNU riscv64-linux-gnu-as/ld（RV32IM）与 qemu-riscv32 执行。基础用例覆盖全局/局部声明、表达式、控制流、递归和多参数调用。性能形状测试覆盖十亿级仿射循环、嵌套循环、周期分支和多参数函数。</w:t>
       </w:r>
     </w:p>
     <w:p>
@@ -995,7 +917,7 @@
                 <w:b w:val="0"/>
                 <w:sz w:val="19"/>
               </w:rPr>
-              <w:t>120 个分支 helper + 80 个寄存器分配随机程序</w:t>
+              <w:t>9 个定向程序，与宿主 GCC 退出码对照</w:t>
             </w:r>
           </w:p>
         </w:tc>
@@ -1012,7 +934,7 @@
                 <w:b w:val="0"/>
                 <w:sz w:val="19"/>
               </w:rPr>
-              <w:t>全部通过</w:t>
+              <w:t>9/9 通过</w:t>
             </w:r>
           </w:p>
         </w:tc>
@@ -1031,7 +953,7 @@
                 <w:b w:val="0"/>
                 <w:sz w:val="19"/>
               </w:rPr>
-              <w:t>shadow 回归</w:t>
+              <w:t>语义覆盖</w:t>
             </w:r>
           </w:p>
         </w:tc>
@@ -1048,60 +970,7 @@
                 <w:b w:val="0"/>
                 <w:sz w:val="19"/>
               </w:rPr>
-              <w:t>14 个定向 + 100 个随机作用域程序</w:t>
-            </w:r>
-          </w:p>
-        </w:tc>
-        <w:tc>
-          <w:tcPr>
-            <w:tcW w:type="dxa" w:w="3105"/>
-            <w:vAlign w:val="center"/>
-          </w:tcPr>
-          <w:p>
-            <w:r/>
-            <w:r>
-              <w:rPr>
-                <w:rFonts w:ascii="宋体" w:hAnsi="宋体" w:eastAsia="宋体"/>
-                <w:b w:val="0"/>
-                <w:sz w:val="19"/>
-              </w:rPr>
-              <w:t>114/114 通过</w:t>
-            </w:r>
-          </w:p>
-        </w:tc>
-      </w:tr>
-      <w:tr>
-        <w:tc>
-          <w:tcPr>
-            <w:tcW w:type="dxa" w:w="3105"/>
-            <w:vAlign w:val="center"/>
-          </w:tcPr>
-          <w:p>
-            <w:r/>
-            <w:r>
-              <w:rPr>
-                <w:rFonts w:ascii="宋体" w:hAnsi="宋体" w:eastAsia="宋体"/>
-                <w:b w:val="0"/>
-                <w:sz w:val="19"/>
-              </w:rPr>
-              <w:t>寄存器压力</w:t>
-            </w:r>
-          </w:p>
-        </w:tc>
-        <w:tc>
-          <w:tcPr>
-            <w:tcW w:type="dxa" w:w="3105"/>
-            <w:vAlign w:val="center"/>
-          </w:tcPr>
-          <w:p>
-            <w:r/>
-            <w:r>
-              <w:rPr>
-                <w:rFonts w:ascii="宋体" w:hAnsi="宋体" w:eastAsia="宋体"/>
-                <w:b w:val="0"/>
-                <w:sz w:val="19"/>
-              </w:rPr>
-              <w:t>12 至 1000 个局部对象、嵌套循环、超过 12 位栈偏移</w:t>
+              <w:t>shadow、短路副作用、递归、11 参数、全局状态、除模循环</w:t>
             </w:r>
           </w:p>
         </w:tc>
@@ -1137,7 +1006,7 @@
                 <w:b w:val="0"/>
                 <w:sz w:val="19"/>
               </w:rPr>
-              <w:t>清洗器</w:t>
+              <w:t>代码形态</w:t>
             </w:r>
           </w:p>
         </w:tc>
@@ -1154,7 +1023,7 @@
                 <w:b w:val="0"/>
                 <w:sz w:val="19"/>
               </w:rPr>
-              <w:t>ASan + UBSan，含 121 个 shadow/大栈压力程序</w:t>
+              <w:t>3 个大循环/嵌套/helper 用例</w:t>
             </w:r>
           </w:p>
         </w:tc>
@@ -1171,7 +1040,7 @@
                 <w:b w:val="0"/>
                 <w:sz w:val="19"/>
               </w:rPr>
-              <w:t>通过</w:t>
+              <w:t>均生成运行时分支</w:t>
             </w:r>
           </w:p>
         </w:tc>
@@ -1190,7 +1059,7 @@
                 <w:b w:val="0"/>
                 <w:sz w:val="19"/>
               </w:rPr>
-              <w:t>退化路径</w:t>
+              <w:t>编译流水线</w:t>
             </w:r>
           </w:p>
         </w:tc>
@@ -1207,7 +1076,7 @@
                 <w:b w:val="0"/>
                 <w:sz w:val="19"/>
               </w:rPr>
-              <w:t>禁止内联/摘要的全局副作用、递归、循环 helper</w:t>
+              <w:t>SafeOptimizer -&gt; StaticAnalyzer -&gt; RangeAnalyzer -&gt; CodeGen</w:t>
             </w:r>
           </w:p>
         </w:tc>
@@ -1224,7 +1093,7 @@
                 <w:b w:val="0"/>
                 <w:sz w:val="19"/>
               </w:rPr>
-              <w:t>正确回退</w:t>
+              <w:t>路径固定</w:t>
             </w:r>
           </w:p>
         </w:tc>
@@ -1344,7 +1213,7 @@
                 <w:b w:val="0"/>
                 <w:sz w:val="19"/>
               </w:rPr>
-              <w:t>main 读取流并调用 CodeGen 或常量专用汇编生成器</w:t>
+              <w:t>main 读取流并调用静态分析与 CodeGen</w:t>
             </w:r>
           </w:p>
         </w:tc>
@@ -1467,7 +1336,7 @@
                 <w:b w:val="0"/>
                 <w:sz w:val="19"/>
               </w:rPr>
-              <w:t>114 个 shadow 回归</w:t>
+              <w:t>定向 RV32 差分</w:t>
             </w:r>
           </w:p>
         </w:tc>
@@ -1644,7 +1513,7 @@
     <w:p>
       <w:pPr/>
       <w:r>
-        <w:t>2026-07-12 对提交 bd038e8 的最近一次完整有效评测中，30 个功能测试全部通过，功能分为 100。12 个性能点中 11 个达到 100%，p07_loop 为 5001ms、性能比例 4%，因此 OJ 评测分为 98.02。之后的 20752d6（热度寄存器分配）和 2dd0bb1（shadow DCE 修复）因评测服务器连接失败尚未取得完整新结果。该记录说明功能覆盖稳定，但不能把当前结果描述为已经满分。</w:t>
+        <w:t>当前报告只记录静态编译流水线的结果。不同实现路径的历史成绩不作为本版本成绩；最终在线分数应在提交当前源码后按评测系统实际结果补填。现阶段本地严格构建、代码生成形态检查和 RV32 端到端样例均已通过。</w:t>
       </w:r>
     </w:p>
     <w:p>
@@ -1671,6 +1540,8 @@
         <w:t>make</w:t>
         <w:br/>
         <w:t>make test</w:t>
+        <w:br/>
+        <w:t>make check</w:t>
         <w:br/>
         <w:t>./main &lt; tests/basic.tc &gt; basic.s</w:t>
         <w:br/>
@@ -1714,7 +1585,7 @@
         <w:pStyle w:val="ListNumber"/>
       </w:pPr>
       <w:r>
-        <w:t>大循环：逐轮解释无法满足性能要求，最终增加带证明门槛的矩阵、周期和状态摘要，并保留失败回退。</w:t>
+        <w:t>大循环：通过循环深度加权寄存器分配、循环不变量外提、直接条件分支和安全的常量除模强度削弱减少每轮指令；不能证明安全时保留通用代码。</w:t>
       </w:r>
     </w:p>
     <w:p>
@@ -2040,7 +1911,7 @@
     <w:p>
       <w:pPr/>
       <w:r>
-        <w:t>项目已完成 ToyC 前端、语义处理、优化管线和 RISC-V32 后端，并通过全部在线功能测试。实现过程中坚持语义证明失败即回退，不使用外部编译器框架或隐藏用例特判。后续工作的重点是分析 p07_loop 未命中的循环转移形态，继续改进通用循环摘要和真实后端循环优化；同时应补充更多可复现的随机差分脚本，并由小组填写成员信息后提交最终报告。</w:t>
+        <w:t>项目已完成 ToyC 前端、语义处理、优化管线和 RISC-V32 后端，并通过本地功能测试与 RV32 端到端样例。实现过程中坚持语义证明失败即回退，不使用外部编译器框架或隐藏用例特判。后续工作的重点是分析 p07_loop 的热点循环形态，继续改进静态循环分析和真实后端循环优化；同时应补充更多可复现的随机差分脚本，并由小组填写成员信息后提交最终报告。</w:t>
       </w:r>
     </w:p>
     <w:sectPr>

</xml_diff>

<commit_message>
docs: explain compliant affine loop optimization
</commit_message>
<xml_diff>
--- a/docs/practice_report.docx
+++ b/docs/practice_report.docx
@@ -313,6 +313,14 @@
         <w:br/>
         <w:t xml:space="preserve">                         |</w:t>
         <w:br/>
+        <w:t xml:space="preserve"> AffineLoopOptimizer（计数循环闭式降低）</w:t>
+        <w:br/>
+        <w:t xml:space="preserve">                         |</w:t>
+        <w:br/>
+        <w:t xml:space="preserve">       StaticAnalyzer（重写后重新解析）</w:t>
+        <w:br/>
+        <w:t xml:space="preserve">                         |</w:t>
+        <w:br/>
         <w:t xml:space="preserve">       RangeAnalyzer（整数区间证明）</w:t>
         <w:br/>
         <w:t xml:space="preserve">                         |</w:t>
@@ -362,6 +370,14 @@
       </w:pPr>
       <w:r>
         <w:t>StaticAnalyzer：解析词法绑定、分配局部槽位、记录运算符和循环编号，并做保守的向后活跃性分析。</w:t>
+      </w:r>
+    </w:p>
+    <w:p>
+      <w:pPr>
+        <w:pStyle w:val="ListBullet"/>
+      </w:pPr>
+      <w:r>
+        <w:t>AffineLoopOptimizer：对精确证明迭代次数的直线仿射计数循环构造 32 位状态转移矩阵，生成带入口条件的运行时闭式赋值。</w:t>
       </w:r>
     </w:p>
     <w:p>
@@ -551,7 +567,33 @@
         <w:pStyle w:val="Heading2"/>
       </w:pPr>
       <w:r>
-        <w:t>5.3 后端代码优化</w:t>
+        <w:t>5.3 仿射计数循环闭式降低</w:t>
+      </w:r>
+    </w:p>
+    <w:p>
+      <w:pPr/>
+      <w:r>
+        <w:t>AffineLoopOptimizer 在槽位解析后对循环做结构证明。仅当循环为直线赋值、右值是状态变量的仿射组合、边界在循环内不变，且局部常量数据流能精确证明起点、单调步长、有限迭代次数和无归纳变量溢出时才触发。一次循环的状态转换表示为模 2^32 的矩阵 M，编译器用快速幂求 M^n，再把原循环改写为“入口条件 + 同时状态赋值”。编译阶段不遍历 ToyC 循环，不调用 ToyC 函数，也不求 main() 返回值。</w:t>
+      </w:r>
+    </w:p>
+    <w:p>
+      <w:pPr/>
+      <w:r>
+        <w:t>另一条活跃性规则删除“已证明有限、无函数调用、无全局写入，且所有局部结果在循环后均不可观测”的死循环。包含 break/continue/嵌套循环、边界在循环内变化、步长依赖分支或可能有符号溢出的情况均回退到原始循环。</w:t>
+      </w:r>
+    </w:p>
+    <w:p>
+      <w:pPr/>
+      <w:r>
+        <w:t>改写会引入内部临时变量，因此随后重新运行 StaticAnalyzer，重建槽位、绑定和活跃性，避免沿用改写前的死存储结论。</w:t>
+      </w:r>
+    </w:p>
+    <w:p>
+      <w:pPr>
+        <w:pStyle w:val="Heading2"/>
+      </w:pPr>
+      <w:r>
+        <w:t>5.4 后端代码优化</w:t>
       </w:r>
     </w:p>
     <w:p>
@@ -565,7 +607,7 @@
         <w:pStyle w:val="Heading2"/>
       </w:pPr>
       <w:r>
-        <w:t>5.4 RISC-V32 后端优化</w:t>
+        <w:t>5.5 RISC-V32 后端优化</w:t>
       </w:r>
     </w:p>
     <w:p>
@@ -900,7 +942,7 @@
                 <w:b w:val="0"/>
                 <w:sz w:val="19"/>
               </w:rPr>
-              <w:t>RV32 差分</w:t>
+              <w:t>RV32 定向差分</w:t>
             </w:r>
           </w:p>
         </w:tc>
@@ -917,7 +959,7 @@
                 <w:b w:val="0"/>
                 <w:sz w:val="19"/>
               </w:rPr>
-              <w:t>9 个定向程序，与宿主 GCC 退出码对照</w:t>
+              <w:t>9 个程序，与宿主 GCC 结果对照</w:t>
             </w:r>
           </w:p>
         </w:tc>
@@ -935,6 +977,59 @@
                 <w:sz w:val="19"/>
               </w:rPr>
               <w:t>9/9 通过</w:t>
+            </w:r>
+          </w:p>
+        </w:tc>
+      </w:tr>
+      <w:tr>
+        <w:tc>
+          <w:tcPr>
+            <w:tcW w:type="dxa" w:w="3105"/>
+            <w:vAlign w:val="center"/>
+          </w:tcPr>
+          <w:p>
+            <w:r/>
+            <w:r>
+              <w:rPr>
+                <w:rFonts w:ascii="宋体" w:hAnsi="宋体" w:eastAsia="宋体"/>
+                <w:b w:val="0"/>
+                <w:sz w:val="19"/>
+              </w:rPr>
+              <w:t>仿射随机差分</w:t>
+            </w:r>
+          </w:p>
+        </w:tc>
+        <w:tc>
+          <w:tcPr>
+            <w:tcW w:type="dxa" w:w="3105"/>
+            <w:vAlign w:val="center"/>
+          </w:tcPr>
+          <w:p>
+            <w:r/>
+            <w:r>
+              <w:rPr>
+                <w:rFonts w:ascii="宋体" w:hAnsi="宋体" w:eastAsia="宋体"/>
+                <w:b w:val="0"/>
+                <w:sz w:val="19"/>
+              </w:rPr>
+              <w:t>正/负步长、四种关系、顺序依赖、临时变量与 32 位回绕</w:t>
+            </w:r>
+          </w:p>
+        </w:tc>
+        <w:tc>
+          <w:tcPr>
+            <w:tcW w:type="dxa" w:w="3105"/>
+            <w:vAlign w:val="center"/>
+          </w:tcPr>
+          <w:p>
+            <w:r/>
+            <w:r>
+              <w:rPr>
+                <w:rFonts w:ascii="宋体" w:hAnsi="宋体" w:eastAsia="宋体"/>
+                <w:b w:val="0"/>
+                <w:sz w:val="19"/>
+              </w:rPr>
+              <w:t>120/120 通过</w:t>
             </w:r>
           </w:p>
         </w:tc>
@@ -1076,7 +1171,7 @@
                 <w:b w:val="0"/>
                 <w:sz w:val="19"/>
               </w:rPr>
-              <w:t>SafeOptimizer -&gt; StaticAnalyzer -&gt; RangeAnalyzer -&gt; CodeGen</w:t>
+              <w:t>SafeOptimizer -&gt; StaticAnalyzer -&gt; AffineLoopOptimizer -&gt; StaticAnalyzer -&gt; RangeAnalyzer -&gt; CodeGen</w:t>
             </w:r>
           </w:p>
         </w:tc>
@@ -1103,7 +1198,7 @@
     <w:p>
       <w:pPr/>
       <w:r>
-        <w:t>上述扩展差分在开发环境执行，不是 OJ 构建依赖；所用汇编器为 GNU binutils 2.44，执行器为 QEMU 10.0.8。参考结果来自等价 C 程序或独立的 32 位整数 oracle，并比较完整返回值/退出码。</w:t>
+        <w:t>上述扩展差分在开发环境执行，不是 OJ 构建依赖。定向差分所用汇编器为 GNU binutils 2.44，执行器为 QEMU 10.0.8；随机仿射用例使用 RiscEmu 直接执行生成汇编。参考结果来自等价 C 程序或独立的 32 位整数 oracle，并比较完整返回值/退出码。</w:t>
       </w:r>
     </w:p>
     <w:p>

</xml_diff>

<commit_message>
perf: summarize rectangular affine loop nests
</commit_message>
<xml_diff>
--- a/docs/practice_report.docx
+++ b/docs/practice_report.docx
@@ -573,19 +573,19 @@
     <w:p>
       <w:pPr/>
       <w:r>
-        <w:t>AffineLoopOptimizer 在槽位解析后对循环做结构证明。仅当循环为直线赋值、右值是状态变量的仿射组合、边界在循环内不变，且局部常量数据流能精确证明起点、单调步长、有限迭代次数和无归纳变量溢出时才触发。一次循环的状态转换表示为模 2^32 的矩阵 M，编译器用快速幂求 M^n，再把原循环改写为“入口条件 + 同时状态赋值”。编译阶段不遍历 ToyC 循环，不调用 ToyC 函数，也不求 main() 返回值。</w:t>
+        <w:t>AffineLoopOptimizer 在槽位解析后对循环做结构证明。仅当循环由顺序仿射赋值组成（分支必须能在当前符号状态下证明为常量）、边界在循环内不变，且局部常量数据流能精确证明起点、单调步长、有限迭代次数和无归纳变量溢出时才触发。一次循环的状态转换表示为模 2^32 的矩阵 M，编译器用快速幂求 M^n，再把原循环改写为“入口条件 + 同时状态赋值”。编译阶段不遍历 ToyC 循环，不调用 ToyC 函数，也不求 main() 返回值。</w:t>
       </w:r>
     </w:p>
     <w:p>
       <w:pPr/>
       <w:r>
-        <w:t>另一条活跃性规则删除“已证明有限、无函数调用、无全局写入，且所有局部结果在循环后均不可观测”的死循环。包含 break/continue/嵌套循环、边界在循环内变化、步长依赖分支或可能有符号溢出的情况均回退到原始循环。</w:t>
+        <w:t>另一条活跃性规则删除“已证明有限、无函数调用、无全局写入，且所有局部结果在循环后均不可观测”的死循环。包含 break/continue/未改写的嵌套循环、边界在循环内变化、步长依赖分支或可能有符号溢出的情况均回退到原始循环。</w:t>
       </w:r>
     </w:p>
     <w:p>
       <w:pPr/>
       <w:r>
-        <w:t>改写会引入内部临时变量，因此随后重新运行 StaticAnalyzer，重建槽位、绑定和活跃性，避免沿用改写前的死存储结论。</w:t>
+        <w:t>改写会引入内部临时变量，因此每轮成功改写后重新运行 StaticAnalyzer，重建槽位、绑定和活跃性，避免沿用改写前的死存储结论。流水线最多执行四轮，使固定边界的矩形嵌套循环可以先闭式化内层，再把得到的状态转移并入外层。</w:t>
       </w:r>
     </w:p>
     <w:p>
@@ -1048,6 +1048,59 @@
                 <w:b w:val="0"/>
                 <w:sz w:val="19"/>
               </w:rPr>
+              <w:t>嵌套仿射随机差分</w:t>
+            </w:r>
+          </w:p>
+        </w:tc>
+        <w:tc>
+          <w:tcPr>
+            <w:tcW w:type="dxa" w:w="3105"/>
+            <w:vAlign w:val="center"/>
+          </w:tcPr>
+          <w:p>
+            <w:r/>
+            <w:r>
+              <w:rPr>
+                <w:rFonts w:ascii="宋体" w:hAnsi="宋体" w:eastAsia="宋体"/>
+                <w:b w:val="0"/>
+                <w:sz w:val="19"/>
+              </w:rPr>
+              <w:t>矩形双层循环、常量分支、顺序依赖与 32 位回绕</w:t>
+            </w:r>
+          </w:p>
+        </w:tc>
+        <w:tc>
+          <w:tcPr>
+            <w:tcW w:type="dxa" w:w="3105"/>
+            <w:vAlign w:val="center"/>
+          </w:tcPr>
+          <w:p>
+            <w:r/>
+            <w:r>
+              <w:rPr>
+                <w:rFonts w:ascii="宋体" w:hAnsi="宋体" w:eastAsia="宋体"/>
+                <w:b w:val="0"/>
+                <w:sz w:val="19"/>
+              </w:rPr>
+              <w:t>200/200 通过</w:t>
+            </w:r>
+          </w:p>
+        </w:tc>
+      </w:tr>
+      <w:tr>
+        <w:tc>
+          <w:tcPr>
+            <w:tcW w:type="dxa" w:w="3105"/>
+            <w:vAlign w:val="center"/>
+          </w:tcPr>
+          <w:p>
+            <w:r/>
+            <w:r>
+              <w:rPr>
+                <w:rFonts w:ascii="宋体" w:hAnsi="宋体" w:eastAsia="宋体"/>
+                <w:b w:val="0"/>
+                <w:sz w:val="19"/>
+              </w:rPr>
               <w:t>语义覆盖</w:t>
             </w:r>
           </w:p>
@@ -1118,7 +1171,7 @@
                 <w:b w:val="0"/>
                 <w:sz w:val="19"/>
               </w:rPr>
-              <w:t>3 个大循环/嵌套/helper 用例</w:t>
+              <w:t>大循环、动态/矩形嵌套和 helper 用例</w:t>
             </w:r>
           </w:p>
         </w:tc>
@@ -1135,7 +1188,7 @@
                 <w:b w:val="0"/>
                 <w:sz w:val="19"/>
               </w:rPr>
-              <w:t>均生成运行时分支</w:t>
+              <w:t>均生成运行时分支，矩形嵌套无回边</w:t>
             </w:r>
           </w:p>
         </w:tc>
@@ -1171,7 +1224,7 @@
                 <w:b w:val="0"/>
                 <w:sz w:val="19"/>
               </w:rPr>
-              <w:t>SafeOptimizer -&gt; StaticAnalyzer -&gt; AffineLoopOptimizer -&gt; StaticAnalyzer -&gt; RangeAnalyzer -&gt; CodeGen</w:t>
+              <w:t>SafeOptimizer -&gt; (StaticAnalyzer -&gt; AffineLoopOptimizer) x4 -&gt; RangeAnalyzer -&gt; CodeGen</w:t>
             </w:r>
           </w:p>
         </w:tc>
@@ -1188,7 +1241,7 @@
                 <w:b w:val="0"/>
                 <w:sz w:val="19"/>
               </w:rPr>
-              <w:t>路径固定</w:t>
+              <w:t>改写后重新分析</w:t>
             </w:r>
           </w:p>
         </w:tc>

</xml_diff>

<commit_message>
perf: summarize proven periodic affine loops
</commit_message>
<xml_diff>
--- a/docs/practice_report.docx
+++ b/docs/practice_report.docx
@@ -573,7 +573,13 @@
     <w:p>
       <w:pPr/>
       <w:r>
-        <w:t>AffineLoopOptimizer 在槽位解析后对循环做结构证明。仅当循环由顺序仿射赋值组成（分支必须能在当前符号状态下证明为常量）、边界在循环内不变，且局部常量数据流能精确证明起点、单调步长、有限迭代次数和无归纳变量溢出时才触发。一次循环的状态转换表示为模 2^32 的矩阵 M，编译器用快速幂求 M^n，再把原循环改写为“入口条件 + 同时状态赋值”。编译阶段不遍历 ToyC 循环，不调用 ToyC 函数，也不求 main() 返回值。</w:t>
+        <w:t>AffineLoopOptimizer 在槽位解析后对循环做结构证明。仅当循环由顺序仿射赋值组成、边界在循环内不变，且局部常量数据流能精确证明起点、单调步长、有限迭代次数和无归纳变量溢出时才触发。普通分支必须能在当前符号状态下证明为常量；对仅依赖非负归纳变量 i % m 的分支，则证明有限余数周期并为每个相位构造状态矩阵。相位数上限为 256，循环必须至少覆盖两个完整周期，否则回退。</w:t>
+      </w:r>
+    </w:p>
+    <w:p>
+      <w:pPr/>
+      <w:r>
+        <w:t>一次循环或完整周期的状态转换表示为模 2^32 的矩阵 M，编译器用快速幂求 M^n，再把原循环改写为“入口条件 + 同时状态赋值”。这里枚举的是有上限的抽象余数相位，不是 ToyC 的实际迭代次数；编译阶段不执行 ToyC 语句、不调用 ToyC 函数，也不求 main() 返回值。</w:t>
       </w:r>
     </w:p>
     <w:p>
@@ -1101,6 +1107,112 @@
                 <w:b w:val="0"/>
                 <w:sz w:val="19"/>
               </w:rPr>
+              <w:t>周期仿射随机差分</w:t>
+            </w:r>
+          </w:p>
+        </w:tc>
+        <w:tc>
+          <w:tcPr>
+            <w:tcW w:type="dxa" w:w="3105"/>
+            <w:vAlign w:val="center"/>
+          </w:tcPr>
+          <w:p>
+            <w:r/>
+            <w:r>
+              <w:rPr>
+                <w:rFonts w:ascii="宋体" w:hAnsi="宋体" w:eastAsia="宋体"/>
+                <w:b w:val="0"/>
+                <w:sz w:val="19"/>
+              </w:rPr>
+              <w:t>多模数周期、不同步长、短路分支、顺序依赖与回绕</w:t>
+            </w:r>
+          </w:p>
+        </w:tc>
+        <w:tc>
+          <w:tcPr>
+            <w:tcW w:type="dxa" w:w="3105"/>
+            <w:vAlign w:val="center"/>
+          </w:tcPr>
+          <w:p>
+            <w:r/>
+            <w:r>
+              <w:rPr>
+                <w:rFonts w:ascii="宋体" w:hAnsi="宋体" w:eastAsia="宋体"/>
+                <w:b w:val="0"/>
+                <w:sz w:val="19"/>
+              </w:rPr>
+              <w:t>300/300 通过</w:t>
+            </w:r>
+          </w:p>
+        </w:tc>
+      </w:tr>
+      <w:tr>
+        <w:tc>
+          <w:tcPr>
+            <w:tcW w:type="dxa" w:w="3105"/>
+            <w:vAlign w:val="center"/>
+          </w:tcPr>
+          <w:p>
+            <w:r/>
+            <w:r>
+              <w:rPr>
+                <w:rFonts w:ascii="宋体" w:hAnsi="宋体" w:eastAsia="宋体"/>
+                <w:b w:val="0"/>
+                <w:sz w:val="19"/>
+              </w:rPr>
+              <w:t>周期证明边界</w:t>
+            </w:r>
+          </w:p>
+        </w:tc>
+        <w:tc>
+          <w:tcPr>
+            <w:tcW w:type="dxa" w:w="3105"/>
+            <w:vAlign w:val="center"/>
+          </w:tcPr>
+          <w:p>
+            <w:r/>
+            <w:r>
+              <w:rPr>
+                <w:rFonts w:ascii="宋体" w:hAnsi="宋体" w:eastAsia="宋体"/>
+                <w:b w:val="0"/>
+                <w:sz w:val="19"/>
+              </w:rPr>
+              <w:t>非周期/状态相关条件、负起点/模数、超大或覆盖不足周期</w:t>
+            </w:r>
+          </w:p>
+        </w:tc>
+        <w:tc>
+          <w:tcPr>
+            <w:tcW w:type="dxa" w:w="3105"/>
+            <w:vAlign w:val="center"/>
+          </w:tcPr>
+          <w:p>
+            <w:r/>
+            <w:r>
+              <w:rPr>
+                <w:rFonts w:ascii="宋体" w:hAnsi="宋体" w:eastAsia="宋体"/>
+                <w:b w:val="0"/>
+                <w:sz w:val="19"/>
+              </w:rPr>
+              <w:t>7/7 正确回退</w:t>
+            </w:r>
+          </w:p>
+        </w:tc>
+      </w:tr>
+      <w:tr>
+        <w:tc>
+          <w:tcPr>
+            <w:tcW w:type="dxa" w:w="3105"/>
+            <w:vAlign w:val="center"/>
+          </w:tcPr>
+          <w:p>
+            <w:r/>
+            <w:r>
+              <w:rPr>
+                <w:rFonts w:ascii="宋体" w:hAnsi="宋体" w:eastAsia="宋体"/>
+                <w:b w:val="0"/>
+                <w:sz w:val="19"/>
+              </w:rPr>
               <w:t>语义覆盖</w:t>
             </w:r>
           </w:p>
@@ -1171,7 +1283,7 @@
                 <w:b w:val="0"/>
                 <w:sz w:val="19"/>
               </w:rPr>
-              <w:t>大循环、动态/矩形嵌套和 helper 用例</w:t>
+              <w:t>大循环、动态/矩形嵌套、周期分支和 helper 用例</w:t>
             </w:r>
           </w:p>
         </w:tc>
@@ -1188,7 +1300,7 @@
                 <w:b w:val="0"/>
                 <w:sz w:val="19"/>
               </w:rPr>
-              <w:t>均生成运行时分支，矩形嵌套无回边</w:t>
+              <w:t>均生成运行时分支，已证明循环无回边</w:t>
             </w:r>
           </w:p>
         </w:tc>

</xml_diff>